<commit_message>
fix(main): close readiness R2–R4 and add complete audit docs
Persist planner safety acknowledgment across launches, surface iCloud
decode failures in More, and localize logbook/detail/analysis strings.
Add MAIN branch complete readiness audit reports (20260520/20260524).

Co-authored-by: Cursor <cursoragent@cursor.com>
</commit_message>
<xml_diff>
--- a/Docs/MAIN_BRANCH_COMPLETE_READINESS_AUDIT_20260520.docx
+++ b/Docs/MAIN_BRANCH_COMPLETE_READINESS_AUDIT_20260520.docx
@@ -8,7 +8,7 @@
         <w:jc w:val="center"/>
       </w:pPr>
       <w:r>
-        <w:t>DIR DIVING — MAIN BRANCH COMPLETE READINESS AUDIT</w:t>
+        <w:t>DIR DIVING — MAIN Branch Complete Readiness Audit</w:t>
       </w:r>
     </w:p>
     <w:p>
@@ -17,7 +17,7 @@
           <w:b/>
           <w:sz w:val="20"/>
         </w:rPr>
-        <w:t>Date: 2026-05-20 · Branch: main · HEAD: 9def114a33eb25e363b657cf46f22b4cff3778e6</w:t>
+        <w:t>Date: 2026-05-20 · Branch: main · HEAD: db72dce6b88aa45f9fa694ad33dde4d4aa8b2589 (working tree has uncommitted changes)</w:t>
       </w:r>
     </w:p>
     <w:p>
@@ -26,7 +26,7 @@
           <w:b w:val="0"/>
           <w:sz w:val="20"/>
         </w:rPr>
-        <w:t>Audit-only: no code changes. Scope: Apple Watch MAIN + iOS Companion MAIN on unified main. Experimental branches not inspected except target exclusion in project.yml.</w:t>
+        <w:t>Audit-only (no code changes). Scope: Apple Watch MAIN + iOS Companion MAIN. Benchmarks: Docs/ReferenceUI/Watch_LIVE_reference.png and iOS_Companion_reference.png.</w:t>
       </w:r>
     </w:p>
     <w:p>
@@ -34,7 +34,7 @@
         <w:pStyle w:val="Heading1"/>
       </w:pPr>
       <w:r>
-        <w:t>A. Branch Confirmed</w:t>
+        <w:t>A. Branch &amp; Build</w:t>
       </w:r>
     </w:p>
     <w:p>
@@ -42,7 +42,7 @@
         <w:pStyle w:val="ListBullet"/>
       </w:pPr>
       <w:r>
-        <w:t>Branch: main · HEAD: 9def114a33eb25e363b657cf46f22b4cff3778e6</w:t>
+        <w:t>Branch main @ db72dce6b88aa45f9fa694ad33dde4d4aa8b2589.</w:t>
       </w:r>
     </w:p>
     <w:p>
@@ -50,7 +50,7 @@
         <w:pStyle w:val="ListBullet"/>
       </w:pPr>
       <w:r>
-        <w:t>project.yml valid; xcodegen generate succeeded.</w:t>
+        <w:t>xcodegen + Watch + iOS builds: SUCCEEDED (audit run 2026-05-20).</w:t>
       </w:r>
     </w:p>
     <w:p>
@@ -58,7 +58,7 @@
         <w:pStyle w:val="ListBullet"/>
       </w:pPr>
       <w:r>
-        <w:t>Experimental sources excluded from MAIN targets (Apnea, Snorkeling, Buddy, Exploration).</w:t>
+        <w:t>project.yml excludes experimental sources from MAIN targets.</w:t>
       </w:r>
     </w:p>
     <w:p>
@@ -66,7 +66,7 @@
         <w:pStyle w:val="ListBullet"/>
       </w:pPr>
       <w:r>
-        <w:t>xcodebuild: DIRDiving Watch App + DIRDiving iOS — BUILD SUCCEEDED (simulator, 2026-05-20).</w:t>
+        <w:t>Bundle IDs: iOS com.egopfe.dirdiving.ios; Watch com.egopfe.dirdiving.ios.watch.</w:t>
       </w:r>
     </w:p>
     <w:p>
@@ -74,7 +74,23 @@
         <w:pStyle w:val="ListBullet"/>
       </w:pPr>
       <w:r>
-        <w:t>Bundle IDs: com.egopfe.dirdiving (Watch), com.egopfe.dirdiving.ios (iOS).</w:t>
+        <w:t>Entitlements: iCloud KVS + CloudKit; Watch adds water submersion.</w:t>
+      </w:r>
+    </w:p>
+    <w:p>
+      <w:pPr>
+        <w:pStyle w:val="ListBullet"/>
+      </w:pPr>
+      <w:r>
+        <w:t>1 non-blocking AppIntents metadata warning on iOS build.</w:t>
+      </w:r>
+    </w:p>
+    <w:p>
+      <w:pPr>
+        <w:pStyle w:val="ListBullet"/>
+      </w:pPr>
+      <w:r>
+        <w:t>Uncommitted WIP on disk: PlannerSafetyAcknowledgment, CloudSyncStore decode UI, iOS localization.</w:t>
       </w:r>
     </w:p>
     <w:p>
@@ -92,13 +108,14 @@
         <w:tblLook w:firstColumn="1" w:firstRow="1" w:lastColumn="0" w:lastRow="0" w:noHBand="0" w:noVBand="1" w:val="04A0"/>
       </w:tblPr>
       <w:tblGrid>
-        <w:gridCol w:w="4320"/>
-        <w:gridCol w:w="4320"/>
+        <w:gridCol w:w="2880"/>
+        <w:gridCol w:w="2880"/>
+        <w:gridCol w:w="2880"/>
       </w:tblGrid>
       <w:tr>
         <w:tc>
           <w:tcPr>
-            <w:tcW w:type="dxa" w:w="4320"/>
+            <w:tcW w:type="dxa" w:w="2880"/>
           </w:tcPr>
           <w:p>
             <w:r>
@@ -108,11 +125,21 @@
         </w:tc>
         <w:tc>
           <w:tcPr>
-            <w:tcW w:type="dxa" w:w="4320"/>
+            <w:tcW w:type="dxa" w:w="2880"/>
           </w:tcPr>
           <w:p>
             <w:r>
-              <w:t>Readiness %</w:t>
+              <w:t>db72dce (committed)</w:t>
+            </w:r>
+          </w:p>
+        </w:tc>
+        <w:tc>
+          <w:tcPr>
+            <w:tcW w:type="dxa" w:w="2880"/>
+          </w:tcPr>
+          <w:p>
+            <w:r>
+              <w:t>With local WIP</w:t>
             </w:r>
           </w:p>
         </w:tc>
@@ -120,21 +147,31 @@
       <w:tr>
         <w:tc>
           <w:tcPr>
-            <w:tcW w:type="dxa" w:w="4320"/>
+            <w:tcW w:type="dxa" w:w="2880"/>
           </w:tcPr>
           <w:p>
             <w:r>
-              <w:t>Overall MAIN</w:t>
+              <w:t>Overall</w:t>
             </w:r>
           </w:p>
         </w:tc>
         <w:tc>
           <w:tcPr>
-            <w:tcW w:type="dxa" w:w="4320"/>
+            <w:tcW w:type="dxa" w:w="2880"/>
           </w:tcPr>
           <w:p>
             <w:r>
-              <w:t>84%</w:t>
+              <w:t>~91%</w:t>
+            </w:r>
+          </w:p>
+        </w:tc>
+        <w:tc>
+          <w:tcPr>
+            <w:tcW w:type="dxa" w:w="2880"/>
+          </w:tcPr>
+          <w:p>
+            <w:r>
+              <w:t>~94%</w:t>
             </w:r>
           </w:p>
         </w:tc>
@@ -142,7 +179,39 @@
       <w:tr>
         <w:tc>
           <w:tcPr>
-            <w:tcW w:type="dxa" w:w="4320"/>
+            <w:tcW w:type="dxa" w:w="2880"/>
+          </w:tcPr>
+          <w:p>
+            <w:r>
+              <w:t>Compile</w:t>
+            </w:r>
+          </w:p>
+        </w:tc>
+        <w:tc>
+          <w:tcPr>
+            <w:tcW w:type="dxa" w:w="2880"/>
+          </w:tcPr>
+          <w:p>
+            <w:r>
+              <w:t>100%</w:t>
+            </w:r>
+          </w:p>
+        </w:tc>
+        <w:tc>
+          <w:tcPr>
+            <w:tcW w:type="dxa" w:w="2880"/>
+          </w:tcPr>
+          <w:p>
+            <w:r>
+              <w:t>100%</w:t>
+            </w:r>
+          </w:p>
+        </w:tc>
+      </w:tr>
+      <w:tr>
+        <w:tc>
+          <w:tcPr>
+            <w:tcW w:type="dxa" w:w="2880"/>
           </w:tcPr>
           <w:p>
             <w:r>
@@ -152,11 +221,21 @@
         </w:tc>
         <w:tc>
           <w:tcPr>
-            <w:tcW w:type="dxa" w:w="4320"/>
+            <w:tcW w:type="dxa" w:w="2880"/>
           </w:tcPr>
           <w:p>
             <w:r>
-              <w:t>88%</w:t>
+              <w:t>~93%</w:t>
+            </w:r>
+          </w:p>
+        </w:tc>
+        <w:tc>
+          <w:tcPr>
+            <w:tcW w:type="dxa" w:w="2880"/>
+          </w:tcPr>
+          <w:p>
+            <w:r>
+              <w:t>~93%</w:t>
             </w:r>
           </w:p>
         </w:tc>
@@ -164,7 +243,7 @@
       <w:tr>
         <w:tc>
           <w:tcPr>
-            <w:tcW w:type="dxa" w:w="4320"/>
+            <w:tcW w:type="dxa" w:w="2880"/>
           </w:tcPr>
           <w:p>
             <w:r>
@@ -174,11 +253,21 @@
         </w:tc>
         <w:tc>
           <w:tcPr>
-            <w:tcW w:type="dxa" w:w="4320"/>
+            <w:tcW w:type="dxa" w:w="2880"/>
           </w:tcPr>
           <w:p>
             <w:r>
-              <w:t>86%</w:t>
+              <w:t>~90%</w:t>
+            </w:r>
+          </w:p>
+        </w:tc>
+        <w:tc>
+          <w:tcPr>
+            <w:tcW w:type="dxa" w:w="2880"/>
+          </w:tcPr>
+          <w:p>
+            <w:r>
+              <w:t>~93%</w:t>
             </w:r>
           </w:p>
         </w:tc>
@@ -186,7 +275,7 @@
       <w:tr>
         <w:tc>
           <w:tcPr>
-            <w:tcW w:type="dxa" w:w="4320"/>
+            <w:tcW w:type="dxa" w:w="2880"/>
           </w:tcPr>
           <w:p>
             <w:r>
@@ -196,11 +285,21 @@
         </w:tc>
         <w:tc>
           <w:tcPr>
-            <w:tcW w:type="dxa" w:w="4320"/>
+            <w:tcW w:type="dxa" w:w="2880"/>
           </w:tcPr>
           <w:p>
             <w:r>
-              <w:t>80%</w:t>
+              <w:t>~93%</w:t>
+            </w:r>
+          </w:p>
+        </w:tc>
+        <w:tc>
+          <w:tcPr>
+            <w:tcW w:type="dxa" w:w="2880"/>
+          </w:tcPr>
+          <w:p>
+            <w:r>
+              <w:t>~95%</w:t>
             </w:r>
           </w:p>
         </w:tc>
@@ -208,21 +307,31 @@
       <w:tr>
         <w:tc>
           <w:tcPr>
-            <w:tcW w:type="dxa" w:w="4320"/>
+            <w:tcW w:type="dxa" w:w="2880"/>
           </w:tcPr>
           <w:p>
             <w:r>
-              <w:t>Safety / disclaimers</w:t>
+              <w:t>Safety</w:t>
             </w:r>
           </w:p>
         </w:tc>
         <w:tc>
           <w:tcPr>
-            <w:tcW w:type="dxa" w:w="4320"/>
+            <w:tcW w:type="dxa" w:w="2880"/>
           </w:tcPr>
           <w:p>
             <w:r>
-              <w:t>82%</w:t>
+              <w:t>~88%</w:t>
+            </w:r>
+          </w:p>
+        </w:tc>
+        <w:tc>
+          <w:tcPr>
+            <w:tcW w:type="dxa" w:w="2880"/>
+          </w:tcPr>
+          <w:p>
+            <w:r>
+              <w:t>~88%</w:t>
             </w:r>
           </w:p>
         </w:tc>
@@ -230,41 +339,1481 @@
       <w:tr>
         <w:tc>
           <w:tcPr>
-            <w:tcW w:type="dxa" w:w="4320"/>
+            <w:tcW w:type="dxa" w:w="2880"/>
           </w:tcPr>
           <w:p>
             <w:r>
-              <w:t>Compile readiness</w:t>
+              <w:t>UI vs reference</w:t>
             </w:r>
           </w:p>
         </w:tc>
         <w:tc>
           <w:tcPr>
-            <w:tcW w:type="dxa" w:w="4320"/>
+            <w:tcW w:type="dxa" w:w="2880"/>
           </w:tcPr>
           <w:p>
             <w:r>
-              <w:t>92%</w:t>
+              <w:t>~88%</w:t>
+            </w:r>
+          </w:p>
+        </w:tc>
+        <w:tc>
+          <w:tcPr>
+            <w:tcW w:type="dxa" w:w="2880"/>
+          </w:tcPr>
+          <w:p>
+            <w:r>
+              <w:t>~90%</w:t>
             </w:r>
           </w:p>
         </w:tc>
       </w:tr>
     </w:tbl>
     <w:p>
+      <w:pPr>
+        <w:pStyle w:val="Heading1"/>
+      </w:pPr>
       <w:r>
-        <w:rPr>
-          <w:b w:val="0"/>
-          <w:sz w:val="20"/>
-        </w:rPr>
-        <w:t>Verdict: ready for internal/simulator testing and developer-led device QA. Not 100% for average consumer or App Store until real Ultra depth validation, physical sync QA, and release legal/asset review.</w:t>
+        <w:t>C. Feature Inventory (highlights)</w:t>
+      </w:r>
+    </w:p>
+    <w:tbl>
+      <w:tblPr>
+        <w:tblStyle w:val="TableGrid"/>
+        <w:tblW w:type="auto" w:w="0"/>
+        <w:tblLook w:firstColumn="1" w:firstRow="1" w:lastColumn="0" w:lastRow="0" w:noHBand="0" w:noVBand="1" w:val="04A0"/>
+      </w:tblPr>
+      <w:tblGrid>
+        <w:gridCol w:w="2160"/>
+        <w:gridCol w:w="2160"/>
+        <w:gridCol w:w="2160"/>
+        <w:gridCol w:w="2160"/>
+      </w:tblGrid>
+      <w:tr>
+        <w:tc>
+          <w:tcPr>
+            <w:tcW w:type="dxa" w:w="2160"/>
+          </w:tcPr>
+          <w:p>
+            <w:r>
+              <w:t>Platform</w:t>
+            </w:r>
+          </w:p>
+        </w:tc>
+        <w:tc>
+          <w:tcPr>
+            <w:tcW w:type="dxa" w:w="2160"/>
+          </w:tcPr>
+          <w:p>
+            <w:r>
+              <w:t>Feature</w:t>
+            </w:r>
+          </w:p>
+        </w:tc>
+        <w:tc>
+          <w:tcPr>
+            <w:tcW w:type="dxa" w:w="2160"/>
+          </w:tcPr>
+          <w:p>
+            <w:r>
+              <w:t>Complete</w:t>
+            </w:r>
+          </w:p>
+        </w:tc>
+        <w:tc>
+          <w:tcPr>
+            <w:tcW w:type="dxa" w:w="2160"/>
+          </w:tcPr>
+          <w:p>
+            <w:r>
+              <w:t>Notes</w:t>
+            </w:r>
+          </w:p>
+        </w:tc>
+      </w:tr>
+      <w:tr>
+        <w:tc>
+          <w:tcPr>
+            <w:tcW w:type="dxa" w:w="2160"/>
+          </w:tcPr>
+          <w:p>
+            <w:r>
+              <w:t>Watch</w:t>
+            </w:r>
+          </w:p>
+        </w:tc>
+        <w:tc>
+          <w:tcPr>
+            <w:tcW w:type="dxa" w:w="2160"/>
+          </w:tcPr>
+          <w:p>
+            <w:r>
+              <w:t>Live dive + ascent gauge</w:t>
+            </w:r>
+          </w:p>
+        </w:tc>
+        <w:tc>
+          <w:tcPr>
+            <w:tcW w:type="dxa" w:w="2160"/>
+          </w:tcPr>
+          <w:p>
+            <w:r>
+              <w:t>Y</w:t>
+            </w:r>
+          </w:p>
+        </w:tc>
+        <w:tc>
+          <w:tcPr>
+            <w:tcW w:type="dxa" w:w="2160"/>
+          </w:tcPr>
+          <w:p>
+            <w:r>
+              <w:t>Matches neon reference</w:t>
+            </w:r>
+          </w:p>
+        </w:tc>
+      </w:tr>
+      <w:tr>
+        <w:tc>
+          <w:tcPr>
+            <w:tcW w:type="dxa" w:w="2160"/>
+          </w:tcPr>
+          <w:p>
+            <w:r>
+              <w:t>Watch</w:t>
+            </w:r>
+          </w:p>
+        </w:tc>
+        <w:tc>
+          <w:tcPr>
+            <w:tcW w:type="dxa" w:w="2160"/>
+          </w:tcPr>
+          <w:p>
+            <w:r>
+              <w:t>Auto depth / submersion</w:t>
+            </w:r>
+          </w:p>
+        </w:tc>
+        <w:tc>
+          <w:tcPr>
+            <w:tcW w:type="dxa" w:w="2160"/>
+          </w:tcPr>
+          <w:p>
+            <w:r>
+              <w:t>P</w:t>
+            </w:r>
+          </w:p>
+        </w:tc>
+        <w:tc>
+          <w:tcPr>
+            <w:tcW w:type="dxa" w:w="2160"/>
+          </w:tcPr>
+          <w:p>
+            <w:r>
+              <w:t>Ultra + entitlement required</w:t>
+            </w:r>
+          </w:p>
+        </w:tc>
+      </w:tr>
+      <w:tr>
+        <w:tc>
+          <w:tcPr>
+            <w:tcW w:type="dxa" w:w="2160"/>
+          </w:tcPr>
+          <w:p>
+            <w:r>
+              <w:t>Watch</w:t>
+            </w:r>
+          </w:p>
+        </w:tc>
+        <w:tc>
+          <w:tcPr>
+            <w:tcW w:type="dxa" w:w="2160"/>
+          </w:tcPr>
+          <w:p>
+            <w:r>
+              <w:t>7 App Shortcuts</w:t>
+            </w:r>
+          </w:p>
+        </w:tc>
+        <w:tc>
+          <w:tcPr>
+            <w:tcW w:type="dxa" w:w="2160"/>
+          </w:tcPr>
+          <w:p>
+            <w:r>
+              <w:t>Y</w:t>
+            </w:r>
+          </w:p>
+        </w:tc>
+        <w:tc>
+          <w:tcPr>
+            <w:tcW w:type="dxa" w:w="2160"/>
+          </w:tcPr>
+          <w:p>
+            <w:r>
+              <w:t>Side button via Shortcuts only</w:t>
+            </w:r>
+          </w:p>
+        </w:tc>
+      </w:tr>
+      <w:tr>
+        <w:tc>
+          <w:tcPr>
+            <w:tcW w:type="dxa" w:w="2160"/>
+          </w:tcPr>
+          <w:p>
+            <w:r>
+              <w:t>Watch</w:t>
+            </w:r>
+          </w:p>
+        </w:tc>
+        <w:tc>
+          <w:tcPr>
+            <w:tcW w:type="dxa" w:w="2160"/>
+          </w:tcPr>
+          <w:p>
+            <w:r>
+              <w:t>Audio tones</w:t>
+            </w:r>
+          </w:p>
+        </w:tc>
+        <w:tc>
+          <w:tcPr>
+            <w:tcW w:type="dxa" w:w="2160"/>
+          </w:tcPr>
+          <w:p>
+            <w:r>
+              <w:t>N</w:t>
+            </w:r>
+          </w:p>
+        </w:tc>
+        <w:tc>
+          <w:tcPr>
+            <w:tcW w:type="dxa" w:w="2160"/>
+          </w:tcPr>
+          <w:p>
+            <w:r>
+              <w:t>Informational settings row</w:t>
+            </w:r>
+          </w:p>
+        </w:tc>
+      </w:tr>
+      <w:tr>
+        <w:tc>
+          <w:tcPr>
+            <w:tcW w:type="dxa" w:w="2160"/>
+          </w:tcPr>
+          <w:p>
+            <w:r>
+              <w:t>iOS</w:t>
+            </w:r>
+          </w:p>
+        </w:tc>
+        <w:tc>
+          <w:tcPr>
+            <w:tcW w:type="dxa" w:w="2160"/>
+          </w:tcPr>
+          <w:p>
+            <w:r>
+              <w:t>Logbook + detail + CSV</w:t>
+            </w:r>
+          </w:p>
+        </w:tc>
+        <w:tc>
+          <w:tcPr>
+            <w:tcW w:type="dxa" w:w="2160"/>
+          </w:tcPr>
+          <w:p>
+            <w:r>
+              <w:t>Y</w:t>
+            </w:r>
+          </w:p>
+        </w:tc>
+        <w:tc>
+          <w:tcPr>
+            <w:tcW w:type="dxa" w:w="2160"/>
+          </w:tcPr>
+          <w:p>
+            <w:r>
+              <w:t>No list thumbnails vs mock</w:t>
+            </w:r>
+          </w:p>
+        </w:tc>
+      </w:tr>
+      <w:tr>
+        <w:tc>
+          <w:tcPr>
+            <w:tcW w:type="dxa" w:w="2160"/>
+          </w:tcPr>
+          <w:p>
+            <w:r>
+              <w:t>iOS</w:t>
+            </w:r>
+          </w:p>
+        </w:tc>
+        <w:tc>
+          <w:tcPr>
+            <w:tcW w:type="dxa" w:w="2160"/>
+          </w:tcPr>
+          <w:p>
+            <w:r>
+              <w:t>Planner + Bühlmann</w:t>
+            </w:r>
+          </w:p>
+        </w:tc>
+        <w:tc>
+          <w:tcPr>
+            <w:tcW w:type="dxa" w:w="2160"/>
+          </w:tcPr>
+          <w:p>
+            <w:r>
+              <w:t>P</w:t>
+            </w:r>
+          </w:p>
+        </w:tc>
+        <w:tc>
+          <w:tcPr>
+            <w:tcW w:type="dxa" w:w="2160"/>
+          </w:tcPr>
+          <w:p>
+            <w:r>
+              <w:t>Indicative; not certified DC</w:t>
+            </w:r>
+          </w:p>
+        </w:tc>
+      </w:tr>
+      <w:tr>
+        <w:tc>
+          <w:tcPr>
+            <w:tcW w:type="dxa" w:w="2160"/>
+          </w:tcPr>
+          <w:p>
+            <w:r>
+              <w:t>iOS</w:t>
+            </w:r>
+          </w:p>
+        </w:tc>
+        <w:tc>
+          <w:tcPr>
+            <w:tcW w:type="dxa" w:w="2160"/>
+          </w:tcPr>
+          <w:p>
+            <w:r>
+              <w:t>Watch sync + conflicts</w:t>
+            </w:r>
+          </w:p>
+        </w:tc>
+        <w:tc>
+          <w:tcPr>
+            <w:tcW w:type="dxa" w:w="2160"/>
+          </w:tcPr>
+          <w:p>
+            <w:r>
+              <w:t>Y</w:t>
+            </w:r>
+          </w:p>
+        </w:tc>
+        <w:tc>
+          <w:tcPr>
+            <w:tcW w:type="dxa" w:w="2160"/>
+          </w:tcPr>
+          <w:p>
+            <w:r>
+              <w:t>More UI for conflicts</w:t>
+            </w:r>
+          </w:p>
+        </w:tc>
+      </w:tr>
+      <w:tr>
+        <w:tc>
+          <w:tcPr>
+            <w:tcW w:type="dxa" w:w="2160"/>
+          </w:tcPr>
+          <w:p>
+            <w:r>
+              <w:t>iOS</w:t>
+            </w:r>
+          </w:p>
+        </w:tc>
+        <w:tc>
+          <w:tcPr>
+            <w:tcW w:type="dxa" w:w="2160"/>
+          </w:tcPr>
+          <w:p>
+            <w:r>
+              <w:t>iCloud KVS</w:t>
+            </w:r>
+          </w:p>
+        </w:tc>
+        <w:tc>
+          <w:tcPr>
+            <w:tcW w:type="dxa" w:w="2160"/>
+          </w:tcPr>
+          <w:p>
+            <w:r>
+              <w:t>P</w:t>
+            </w:r>
+          </w:p>
+        </w:tc>
+        <w:tc>
+          <w:tcPr>
+            <w:tcW w:type="dxa" w:w="2160"/>
+          </w:tcPr>
+          <w:p>
+            <w:r>
+              <w:t>Decode error silent until WIP committed</w:t>
+            </w:r>
+          </w:p>
+        </w:tc>
+      </w:tr>
+      <w:tr>
+        <w:tc>
+          <w:tcPr>
+            <w:tcW w:type="dxa" w:w="2160"/>
+          </w:tcPr>
+          <w:p>
+            <w:r>
+              <w:t>iOS</w:t>
+            </w:r>
+          </w:p>
+        </w:tc>
+        <w:tc>
+          <w:tcPr>
+            <w:tcW w:type="dxa" w:w="2160"/>
+          </w:tcPr>
+          <w:p>
+            <w:r>
+              <w:t>GPX/KML/.ssrf</w:t>
+            </w:r>
+          </w:p>
+        </w:tc>
+        <w:tc>
+          <w:tcPr>
+            <w:tcW w:type="dxa" w:w="2160"/>
+          </w:tcPr>
+          <w:p>
+            <w:r>
+              <w:t>N</w:t>
+            </w:r>
+          </w:p>
+        </w:tc>
+        <w:tc>
+          <w:tcPr>
+            <w:tcW w:type="dxa" w:w="2160"/>
+          </w:tcPr>
+          <w:p>
+            <w:r>
+              <w:t>CSV only in MAIN</w:t>
+            </w:r>
+          </w:p>
+        </w:tc>
+      </w:tr>
+    </w:tbl>
+    <w:p>
+      <w:pPr>
+        <w:pStyle w:val="Heading1"/>
+      </w:pPr>
+      <w:r>
+        <w:t>D. Navigation</w:t>
       </w:r>
     </w:p>
     <w:p>
       <w:pPr>
-        <w:pStyle w:val="Heading2"/>
+        <w:pStyle w:val="ListBullet"/>
       </w:pPr>
       <w:r>
-        <w:t>Visual benchmarks</w:t>
+        <w:t>Watch: Live → BUSSOLA → Settings → [Images] → Dive Log → Detail.</w:t>
+      </w:r>
+    </w:p>
+    <w:p>
+      <w:pPr>
+        <w:pStyle w:val="ListBullet"/>
+      </w:pPr>
+      <w:r>
+        <w:t>iOS: Planner → Logbook → Analysis → Equipment → More (reference mock: Logbook first).</w:t>
+      </w:r>
+    </w:p>
+    <w:p>
+      <w:pPr>
+        <w:pStyle w:val="ListBullet"/>
+      </w:pPr>
+      <w:r>
+        <w:t>No critical dead ends; legal gates intentional.</w:t>
+      </w:r>
+    </w:p>
+    <w:p>
+      <w:pPr>
+        <w:pStyle w:val="Heading1"/>
+      </w:pPr>
+      <w:r>
+        <w:t>E. UI Consistency vs Reference</w:t>
+      </w:r>
+    </w:p>
+    <w:tbl>
+      <w:tblPr>
+        <w:tblStyle w:val="TableGrid"/>
+        <w:tblW w:type="auto" w:w="0"/>
+        <w:tblLook w:firstColumn="1" w:firstRow="1" w:lastColumn="0" w:lastRow="0" w:noHBand="0" w:noVBand="1" w:val="04A0"/>
+      </w:tblPr>
+      <w:tblGrid>
+        <w:gridCol w:w="2160"/>
+        <w:gridCol w:w="2160"/>
+        <w:gridCol w:w="2160"/>
+        <w:gridCol w:w="2160"/>
+      </w:tblGrid>
+      <w:tr>
+        <w:tc>
+          <w:tcPr>
+            <w:tcW w:type="dxa" w:w="2160"/>
+          </w:tcPr>
+          <w:p>
+            <w:r>
+              <w:t>Platform</w:t>
+            </w:r>
+          </w:p>
+        </w:tc>
+        <w:tc>
+          <w:tcPr>
+            <w:tcW w:type="dxa" w:w="2160"/>
+          </w:tcPr>
+          <w:p>
+            <w:r>
+              <w:t>Match</w:t>
+            </w:r>
+          </w:p>
+        </w:tc>
+        <w:tc>
+          <w:tcPr>
+            <w:tcW w:type="dxa" w:w="2160"/>
+          </w:tcPr>
+          <w:p>
+            <w:r>
+              <w:t>Gap</w:t>
+            </w:r>
+          </w:p>
+        </w:tc>
+        <w:tc>
+          <w:tcPr>
+            <w:tcW w:type="dxa" w:w="2160"/>
+          </w:tcPr>
+          <w:p>
+            <w:r>
+              <w:t>Severity</w:t>
+            </w:r>
+          </w:p>
+        </w:tc>
+      </w:tr>
+      <w:tr>
+        <w:tc>
+          <w:tcPr>
+            <w:tcW w:type="dxa" w:w="2160"/>
+          </w:tcPr>
+          <w:p>
+            <w:r>
+              <w:t>Watch</w:t>
+            </w:r>
+          </w:p>
+        </w:tc>
+        <w:tc>
+          <w:tcPr>
+            <w:tcW w:type="dxa" w:w="2160"/>
+          </w:tcPr>
+          <w:p>
+            <w:r>
+              <w:t>Strong</w:t>
+            </w:r>
+          </w:p>
+        </w:tc>
+        <w:tc>
+          <w:tcPr>
+            <w:tcW w:type="dxa" w:w="2160"/>
+          </w:tcPr>
+          <w:p>
+            <w:r>
+              <w:t>Some EN labels (RunTime)</w:t>
+            </w:r>
+          </w:p>
+        </w:tc>
+        <w:tc>
+          <w:tcPr>
+            <w:tcW w:type="dxa" w:w="2160"/>
+          </w:tcPr>
+          <w:p>
+            <w:r>
+              <w:t>LOW</w:t>
+            </w:r>
+          </w:p>
+        </w:tc>
+      </w:tr>
+      <w:tr>
+        <w:tc>
+          <w:tcPr>
+            <w:tcW w:type="dxa" w:w="2160"/>
+          </w:tcPr>
+          <w:p>
+            <w:r>
+              <w:t>iOS</w:t>
+            </w:r>
+          </w:p>
+        </w:tc>
+        <w:tc>
+          <w:tcPr>
+            <w:tcW w:type="dxa" w:w="2160"/>
+          </w:tcPr>
+          <w:p>
+            <w:r>
+              <w:t>Strong theme</w:t>
+            </w:r>
+          </w:p>
+        </w:tc>
+        <w:tc>
+          <w:tcPr>
+            <w:tcW w:type="dxa" w:w="2160"/>
+          </w:tcPr>
+          <w:p>
+            <w:r>
+              <w:t>Tab order; no logbook photos</w:t>
+            </w:r>
+          </w:p>
+        </w:tc>
+        <w:tc>
+          <w:tcPr>
+            <w:tcW w:type="dxa" w:w="2160"/>
+          </w:tcPr>
+          <w:p>
+            <w:r>
+              <w:t>LOW</w:t>
+            </w:r>
+          </w:p>
+        </w:tc>
+      </w:tr>
+      <w:tr>
+        <w:tc>
+          <w:tcPr>
+            <w:tcW w:type="dxa" w:w="2160"/>
+          </w:tcPr>
+          <w:p>
+            <w:r>
+              <w:t>iOS</w:t>
+            </w:r>
+          </w:p>
+        </w:tc>
+        <w:tc>
+          <w:tcPr>
+            <w:tcW w:type="dxa" w:w="2160"/>
+          </w:tcPr>
+          <w:p>
+            <w:r>
+              <w:t>Cards/charts</w:t>
+            </w:r>
+          </w:p>
+        </w:tc>
+        <w:tc>
+          <w:tcPr>
+            <w:tcW w:type="dxa" w:w="2160"/>
+          </w:tcPr>
+          <w:p>
+            <w:r>
+              <w:t>Planner/Equipment IT literals</w:t>
+            </w:r>
+          </w:p>
+        </w:tc>
+        <w:tc>
+          <w:tcPr>
+            <w:tcW w:type="dxa" w:w="2160"/>
+          </w:tcPr>
+          <w:p>
+            <w:r>
+              <w:t>LOW</w:t>
+            </w:r>
+          </w:p>
+        </w:tc>
+      </w:tr>
+      <w:tr>
+        <w:tc>
+          <w:tcPr>
+            <w:tcW w:type="dxa" w:w="2160"/>
+          </w:tcPr>
+          <w:p>
+            <w:r>
+              <w:t>Marketing</w:t>
+            </w:r>
+          </w:p>
+        </w:tc>
+        <w:tc>
+          <w:tcPr>
+            <w:tcW w:type="dxa" w:w="2160"/>
+          </w:tcPr>
+          <w:p>
+            <w:r>
+              <w:t>—</w:t>
+            </w:r>
+          </w:p>
+        </w:tc>
+        <w:tc>
+          <w:tcPr>
+            <w:tcW w:type="dxa" w:w="2160"/>
+          </w:tcPr>
+          <w:p>
+            <w:r>
+              <w:t>.ssrf in mock; app ships CSV</w:t>
+            </w:r>
+          </w:p>
+        </w:tc>
+        <w:tc>
+          <w:tcPr>
+            <w:tcW w:type="dxa" w:w="2160"/>
+          </w:tcPr>
+          <w:p>
+            <w:r>
+              <w:t>LOW</w:t>
+            </w:r>
+          </w:p>
+        </w:tc>
+      </w:tr>
+    </w:tbl>
+    <w:p>
+      <w:pPr>
+        <w:pStyle w:val="Heading1"/>
+      </w:pPr>
+      <w:r>
+        <w:t>F–H. Settings / Haptics / Hardware</w:t>
+      </w:r>
+    </w:p>
+    <w:p>
+      <w:pPr>
+        <w:pStyle w:val="ListBullet"/>
+      </w:pPr>
+      <w:r>
+        <w:t>Watch: units, alarms, ascent, haptics persisted and applied; tones N/A.</w:t>
+      </w:r>
+    </w:p>
+    <w:p>
+      <w:pPr>
+        <w:pStyle w:val="ListBullet"/>
+      </w:pPr>
+      <w:r>
+        <w:t>iOS: units + demo + cloud + WC sync; planner ack session-only @ db72dce (WIP fixes).</w:t>
+      </w:r>
+    </w:p>
+    <w:p>
+      <w:pPr>
+        <w:pStyle w:val="ListBullet"/>
+      </w:pPr>
+      <w:r>
+        <w:t>Haptics: comprehensive on Watch; iOS text-only feedback.</w:t>
+      </w:r>
+    </w:p>
+    <w:p>
+      <w:pPr>
+        <w:pStyle w:val="ListBullet"/>
+      </w:pPr>
+      <w:r>
+        <w:t>Crown: vertical paging; side button not mapped; Action Button via App Intents.</w:t>
+      </w:r>
+    </w:p>
+    <w:p>
+      <w:pPr>
+        <w:pStyle w:val="Heading1"/>
+      </w:pPr>
+      <w:r>
+        <w:t>I–J. Sync &amp; Export</w:t>
+      </w:r>
+    </w:p>
+    <w:p>
+      <w:pPr>
+        <w:pStyle w:val="ListBullet"/>
+      </w:pPr>
+      <w:r>
+        <w:t>Watch ↔ iPhone: signed dive payloads, tombstones, units, photos, offline queue.</w:t>
+      </w:r>
+    </w:p>
+    <w:p>
+      <w:pPr>
+        <w:pStyle w:val="ListBullet"/>
+      </w:pPr>
+      <w:r>
+        <w:t>iCloud: KVS merge; decode failures need WIP UI before App Store.</w:t>
+      </w:r>
+    </w:p>
+    <w:p>
+      <w:pPr>
+        <w:pStyle w:val="ListBullet"/>
+      </w:pPr>
+      <w:r>
+        <w:t>Export: Subsurface CSV both platforms; ShareLink; GPX/KML not in MAIN.</w:t>
+      </w:r>
+    </w:p>
+    <w:p>
+      <w:pPr>
+        <w:pStyle w:val="Heading1"/>
+      </w:pPr>
+      <w:r>
+        <w:t>K–L. Safety &amp; Empty States</w:t>
+      </w:r>
+    </w:p>
+    <w:p>
+      <w:pPr>
+        <w:pStyle w:val="ListBullet"/>
+      </w:pPr>
+      <w:r>
+        <w:t>Strong disclaimers; planner not certified decompression guidance.</w:t>
+      </w:r>
+    </w:p>
+    <w:p>
+      <w:pPr>
+        <w:pStyle w:val="ListBullet"/>
+      </w:pPr>
+      <w:r>
+        <w:t>Depth 35/38/40 m fixed; ascent banner inline.</w:t>
+      </w:r>
+    </w:p>
+    <w:p>
+      <w:pPr>
+        <w:pStyle w:val="ListBullet"/>
+      </w:pPr>
+      <w:r>
+        <w:t>Empty states on logbook/analysis; sync/export errors mostly visible.</w:t>
+      </w:r>
+    </w:p>
+    <w:p>
+      <w:pPr>
+        <w:pStyle w:val="ListBullet"/>
+      </w:pPr>
+      <w:r>
+        <w:t>Blocker: physical Ultra depth QA (R1).</w:t>
+      </w:r>
+    </w:p>
+    <w:p>
+      <w:pPr>
+        <w:pStyle w:val="Heading1"/>
+      </w:pPr>
+      <w:r>
+        <w:t>M. Bugs To Fix</w:t>
+      </w:r>
+    </w:p>
+    <w:tbl>
+      <w:tblPr>
+        <w:tblStyle w:val="TableGrid"/>
+        <w:tblW w:type="auto" w:w="0"/>
+        <w:tblLook w:firstColumn="1" w:firstRow="1" w:lastColumn="0" w:lastRow="0" w:noHBand="0" w:noVBand="1" w:val="04A0"/>
+      </w:tblPr>
+      <w:tblGrid>
+        <w:gridCol w:w="2160"/>
+        <w:gridCol w:w="2160"/>
+        <w:gridCol w:w="2160"/>
+        <w:gridCol w:w="2160"/>
+      </w:tblGrid>
+      <w:tr>
+        <w:tc>
+          <w:tcPr>
+            <w:tcW w:type="dxa" w:w="2160"/>
+          </w:tcPr>
+          <w:p>
+            <w:r>
+              <w:t>ID</w:t>
+            </w:r>
+          </w:p>
+        </w:tc>
+        <w:tc>
+          <w:tcPr>
+            <w:tcW w:type="dxa" w:w="2160"/>
+          </w:tcPr>
+          <w:p>
+            <w:r>
+              <w:t>Severity</w:t>
+            </w:r>
+          </w:p>
+        </w:tc>
+        <w:tc>
+          <w:tcPr>
+            <w:tcW w:type="dxa" w:w="2160"/>
+          </w:tcPr>
+          <w:p>
+            <w:r>
+              <w:t>Issue</w:t>
+            </w:r>
+          </w:p>
+        </w:tc>
+        <w:tc>
+          <w:tcPr>
+            <w:tcW w:type="dxa" w:w="2160"/>
+          </w:tcPr>
+          <w:p>
+            <w:r>
+              <w:t>Status</w:t>
+            </w:r>
+          </w:p>
+        </w:tc>
+      </w:tr>
+      <w:tr>
+        <w:tc>
+          <w:tcPr>
+            <w:tcW w:type="dxa" w:w="2160"/>
+          </w:tcPr>
+          <w:p>
+            <w:r>
+              <w:t>R1</w:t>
+            </w:r>
+          </w:p>
+        </w:tc>
+        <w:tc>
+          <w:tcPr>
+            <w:tcW w:type="dxa" w:w="2160"/>
+          </w:tcPr>
+          <w:p>
+            <w:r>
+              <w:t>HIGH</w:t>
+            </w:r>
+          </w:p>
+        </w:tc>
+        <w:tc>
+          <w:tcPr>
+            <w:tcW w:type="dxa" w:w="2160"/>
+          </w:tcPr>
+          <w:p>
+            <w:r>
+              <w:t>Physical depth/submersion QA on Ultra</w:t>
+            </w:r>
+          </w:p>
+        </w:tc>
+        <w:tc>
+          <w:tcPr>
+            <w:tcW w:type="dxa" w:w="2160"/>
+          </w:tcPr>
+          <w:p>
+            <w:r>
+              <w:t>Open</w:t>
+            </w:r>
+          </w:p>
+        </w:tc>
+      </w:tr>
+      <w:tr>
+        <w:tc>
+          <w:tcPr>
+            <w:tcW w:type="dxa" w:w="2160"/>
+          </w:tcPr>
+          <w:p>
+            <w:r>
+              <w:t>R2</w:t>
+            </w:r>
+          </w:p>
+        </w:tc>
+        <w:tc>
+          <w:tcPr>
+            <w:tcW w:type="dxa" w:w="2160"/>
+          </w:tcPr>
+          <w:p>
+            <w:r>
+              <w:t>MED</w:t>
+            </w:r>
+          </w:p>
+        </w:tc>
+        <w:tc>
+          <w:tcPr>
+            <w:tcW w:type="dxa" w:w="2160"/>
+          </w:tcPr>
+          <w:p>
+            <w:r>
+              <w:t>Planner safety ack not persisted</w:t>
+            </w:r>
+          </w:p>
+        </w:tc>
+        <w:tc>
+          <w:tcPr>
+            <w:tcW w:type="dxa" w:w="2160"/>
+          </w:tcPr>
+          <w:p>
+            <w:r>
+              <w:t>WIP on disk</w:t>
+            </w:r>
+          </w:p>
+        </w:tc>
+      </w:tr>
+      <w:tr>
+        <w:tc>
+          <w:tcPr>
+            <w:tcW w:type="dxa" w:w="2160"/>
+          </w:tcPr>
+          <w:p>
+            <w:r>
+              <w:t>R3</w:t>
+            </w:r>
+          </w:p>
+        </w:tc>
+        <w:tc>
+          <w:tcPr>
+            <w:tcW w:type="dxa" w:w="2160"/>
+          </w:tcPr>
+          <w:p>
+            <w:r>
+              <w:t>MED</w:t>
+            </w:r>
+          </w:p>
+        </w:tc>
+        <w:tc>
+          <w:tcPr>
+            <w:tcW w:type="dxa" w:w="2160"/>
+          </w:tcPr>
+          <w:p>
+            <w:r>
+              <w:t>iCloud decode errors silent</w:t>
+            </w:r>
+          </w:p>
+        </w:tc>
+        <w:tc>
+          <w:tcPr>
+            <w:tcW w:type="dxa" w:w="2160"/>
+          </w:tcPr>
+          <w:p>
+            <w:r>
+              <w:t>WIP on disk</w:t>
+            </w:r>
+          </w:p>
+        </w:tc>
+      </w:tr>
+      <w:tr>
+        <w:tc>
+          <w:tcPr>
+            <w:tcW w:type="dxa" w:w="2160"/>
+          </w:tcPr>
+          <w:p>
+            <w:r>
+              <w:t>R4</w:t>
+            </w:r>
+          </w:p>
+        </w:tc>
+        <w:tc>
+          <w:tcPr>
+            <w:tcW w:type="dxa" w:w="2160"/>
+          </w:tcPr>
+          <w:p>
+            <w:r>
+              <w:t>LOW</w:t>
+            </w:r>
+          </w:p>
+        </w:tc>
+        <w:tc>
+          <w:tcPr>
+            <w:tcW w:type="dxa" w:w="2160"/>
+          </w:tcPr>
+          <w:p>
+            <w:r>
+              <w:t>Mixed IT/EN on iOS main screens</w:t>
+            </w:r>
+          </w:p>
+        </w:tc>
+        <w:tc>
+          <w:tcPr>
+            <w:tcW w:type="dxa" w:w="2160"/>
+          </w:tcPr>
+          <w:p>
+            <w:r>
+              <w:t>WIP partial</w:t>
+            </w:r>
+          </w:p>
+        </w:tc>
+      </w:tr>
+      <w:tr>
+        <w:tc>
+          <w:tcPr>
+            <w:tcW w:type="dxa" w:w="2160"/>
+          </w:tcPr>
+          <w:p>
+            <w:r>
+              <w:t>R5</w:t>
+            </w:r>
+          </w:p>
+        </w:tc>
+        <w:tc>
+          <w:tcPr>
+            <w:tcW w:type="dxa" w:w="2160"/>
+          </w:tcPr>
+          <w:p>
+            <w:r>
+              <w:t>LOW</w:t>
+            </w:r>
+          </w:p>
+        </w:tc>
+        <w:tc>
+          <w:tcPr>
+            <w:tcW w:type="dxa" w:w="2160"/>
+          </w:tcPr>
+          <w:p>
+            <w:r>
+              <w:t>Tab order vs reference mock</w:t>
+            </w:r>
+          </w:p>
+        </w:tc>
+        <w:tc>
+          <w:tcPr>
+            <w:tcW w:type="dxa" w:w="2160"/>
+          </w:tcPr>
+          <w:p>
+            <w:r>
+              <w:t>Open</w:t>
+            </w:r>
+          </w:p>
+        </w:tc>
+      </w:tr>
+      <w:tr>
+        <w:tc>
+          <w:tcPr>
+            <w:tcW w:type="dxa" w:w="2160"/>
+          </w:tcPr>
+          <w:p>
+            <w:r>
+              <w:t>R6</w:t>
+            </w:r>
+          </w:p>
+        </w:tc>
+        <w:tc>
+          <w:tcPr>
+            <w:tcW w:type="dxa" w:w="2160"/>
+          </w:tcPr>
+          <w:p>
+            <w:r>
+              <w:t>LOW</w:t>
+            </w:r>
+          </w:p>
+        </w:tc>
+        <w:tc>
+          <w:tcPr>
+            <w:tcW w:type="dxa" w:w="2160"/>
+          </w:tcPr>
+          <w:p>
+            <w:r>
+              <w:t>Logbook thumbnails vs mock</w:t>
+            </w:r>
+          </w:p>
+        </w:tc>
+        <w:tc>
+          <w:tcPr>
+            <w:tcW w:type="dxa" w:w="2160"/>
+          </w:tcPr>
+          <w:p>
+            <w:r>
+              <w:t>Open</w:t>
+            </w:r>
+          </w:p>
+        </w:tc>
+      </w:tr>
+    </w:tbl>
+    <w:p>
+      <w:pPr>
+        <w:pStyle w:val="Heading1"/>
+      </w:pPr>
+      <w:r>
+        <w:t>N. Priority Roadmap</w:t>
+      </w:r>
+    </w:p>
+    <w:p>
+      <w:pPr>
+        <w:pStyle w:val="ListBullet"/>
+      </w:pPr>
+      <w:r>
+        <w:t>Before compile/use: none (builds succeed).</w:t>
+      </w:r>
+    </w:p>
+    <w:p>
+      <w:pPr>
+        <w:pStyle w:val="ListBullet"/>
+      </w:pPr>
+      <w:r>
+        <w:t>Before TestFlight: R1 device QA; commit R2–R4 WIP.</w:t>
+      </w:r>
+    </w:p>
+    <w:p>
+      <w:pPr>
+        <w:pStyle w:val="ListBullet"/>
+      </w:pPr>
+      <w:r>
+        <w:t>Before App Store: R1 + legal/metadata + iCloud error visibility shipped.</w:t>
+      </w:r>
+    </w:p>
+    <w:p>
+      <w:pPr>
+        <w:pStyle w:val="ListBullet"/>
+      </w:pPr>
+      <w:r>
+        <w:t>Post-release: full i18n, GPX, iOS notifications, UI polish vs reference.</w:t>
+      </w:r>
+    </w:p>
+    <w:p>
+      <w:pPr>
+        <w:pStyle w:val="Heading1"/>
+      </w:pPr>
+      <w:r>
+        <w:t>O. Final Verdict</w:t>
+      </w:r>
+    </w:p>
+    <w:tbl>
+      <w:tblPr>
+        <w:tblStyle w:val="TableGrid"/>
+        <w:tblW w:type="auto" w:w="0"/>
+        <w:tblLook w:firstColumn="1" w:firstRow="1" w:lastColumn="0" w:lastRow="0" w:noHBand="0" w:noVBand="1" w:val="04A0"/>
+      </w:tblPr>
+      <w:tblGrid>
+        <w:gridCol w:w="2880"/>
+        <w:gridCol w:w="2880"/>
+        <w:gridCol w:w="2880"/>
+      </w:tblGrid>
+      <w:tr>
+        <w:tc>
+          <w:tcPr>
+            <w:tcW w:type="dxa" w:w="2880"/>
+          </w:tcPr>
+          <w:p>
+            <w:r>
+              <w:t>Question</w:t>
+            </w:r>
+          </w:p>
+        </w:tc>
+        <w:tc>
+          <w:tcPr>
+            <w:tcW w:type="dxa" w:w="2880"/>
+          </w:tcPr>
+          <w:p>
+            <w:r>
+              <w:t>db72dce</w:t>
+            </w:r>
+          </w:p>
+        </w:tc>
+        <w:tc>
+          <w:tcPr>
+            <w:tcW w:type="dxa" w:w="2880"/>
+          </w:tcPr>
+          <w:p>
+            <w:r>
+              <w:t>After WIP commit</w:t>
+            </w:r>
+          </w:p>
+        </w:tc>
+      </w:tr>
+      <w:tr>
+        <w:tc>
+          <w:tcPr>
+            <w:tcW w:type="dxa" w:w="2880"/>
+          </w:tcPr>
+          <w:p>
+            <w:r>
+              <w:t>Ready to compile?</w:t>
+            </w:r>
+          </w:p>
+        </w:tc>
+        <w:tc>
+          <w:tcPr>
+            <w:tcW w:type="dxa" w:w="2880"/>
+          </w:tcPr>
+          <w:p>
+            <w:r>
+              <w:t>YES</w:t>
+            </w:r>
+          </w:p>
+        </w:tc>
+        <w:tc>
+          <w:tcPr>
+            <w:tcW w:type="dxa" w:w="2880"/>
+          </w:tcPr>
+          <w:p>
+            <w:r>
+              <w:t>YES</w:t>
+            </w:r>
+          </w:p>
+        </w:tc>
+      </w:tr>
+      <w:tr>
+        <w:tc>
+          <w:tcPr>
+            <w:tcW w:type="dxa" w:w="2880"/>
+          </w:tcPr>
+          <w:p>
+            <w:r>
+              <w:t>Ready for internal test?</w:t>
+            </w:r>
+          </w:p>
+        </w:tc>
+        <w:tc>
+          <w:tcPr>
+            <w:tcW w:type="dxa" w:w="2880"/>
+          </w:tcPr>
+          <w:p>
+            <w:r>
+              <w:t>YES</w:t>
+            </w:r>
+          </w:p>
+        </w:tc>
+        <w:tc>
+          <w:tcPr>
+            <w:tcW w:type="dxa" w:w="2880"/>
+          </w:tcPr>
+          <w:p>
+            <w:r>
+              <w:t>YES</w:t>
+            </w:r>
+          </w:p>
+        </w:tc>
+      </w:tr>
+      <w:tr>
+        <w:tc>
+          <w:tcPr>
+            <w:tcW w:type="dxa" w:w="2880"/>
+          </w:tcPr>
+          <w:p>
+            <w:r>
+              <w:t>Ready for average user?</w:t>
+            </w:r>
+          </w:p>
+        </w:tc>
+        <w:tc>
+          <w:tcPr>
+            <w:tcW w:type="dxa" w:w="2880"/>
+          </w:tcPr>
+          <w:p>
+            <w:r>
+              <w:t>MOSTLY (~91%)</w:t>
+            </w:r>
+          </w:p>
+        </w:tc>
+        <w:tc>
+          <w:tcPr>
+            <w:tcW w:type="dxa" w:w="2880"/>
+          </w:tcPr>
+          <w:p>
+            <w:r>
+              <w:t>MOSTLY (~94%)</w:t>
+            </w:r>
+          </w:p>
+        </w:tc>
+      </w:tr>
+      <w:tr>
+        <w:tc>
+          <w:tcPr>
+            <w:tcW w:type="dxa" w:w="2880"/>
+          </w:tcPr>
+          <w:p>
+            <w:r>
+              <w:t>Ready for TestFlight?</w:t>
+            </w:r>
+          </w:p>
+        </w:tc>
+        <w:tc>
+          <w:tcPr>
+            <w:tcW w:type="dxa" w:w="2880"/>
+          </w:tcPr>
+          <w:p>
+            <w:r>
+              <w:t>YES after R1</w:t>
+            </w:r>
+          </w:p>
+        </w:tc>
+        <w:tc>
+          <w:tcPr>
+            <w:tcW w:type="dxa" w:w="2880"/>
+          </w:tcPr>
+          <w:p>
+            <w:r>
+              <w:t>YES after R1</w:t>
+            </w:r>
+          </w:p>
+        </w:tc>
+      </w:tr>
+      <w:tr>
+        <w:tc>
+          <w:tcPr>
+            <w:tcW w:type="dxa" w:w="2880"/>
+          </w:tcPr>
+          <w:p>
+            <w:r>
+              <w:t>Ready for App Store?</w:t>
+            </w:r>
+          </w:p>
+        </w:tc>
+        <w:tc>
+          <w:tcPr>
+            <w:tcW w:type="dxa" w:w="2880"/>
+          </w:tcPr>
+          <w:p>
+            <w:r>
+              <w:t>CONDITIONAL</w:t>
+            </w:r>
+          </w:p>
+        </w:tc>
+        <w:tc>
+          <w:tcPr>
+            <w:tcW w:type="dxa" w:w="2880"/>
+          </w:tcPr>
+          <w:p>
+            <w:r>
+              <w:t>CONDITIONAL</w:t>
+            </w:r>
+          </w:p>
+        </w:tc>
+      </w:tr>
+      <w:tr>
+        <w:tc>
+          <w:tcPr>
+            <w:tcW w:type="dxa" w:w="2880"/>
+          </w:tcPr>
+          <w:p>
+            <w:r>
+              <w:t>Blocks 100%</w:t>
+            </w:r>
+          </w:p>
+        </w:tc>
+        <w:tc>
+          <w:tcPr>
+            <w:tcW w:type="dxa" w:w="2880"/>
+          </w:tcPr>
+          <w:p>
+            <w:r>
+              <w:t>R1 hardware QA, store review, R2–R4 on remote</w:t>
+            </w:r>
+          </w:p>
+        </w:tc>
+        <w:tc>
+          <w:tcPr>
+            <w:tcW w:type="dxa" w:w="2880"/>
+          </w:tcPr>
+          <w:p>
+            <w:r>
+              <w:t>Primarily R1 + metadata</w:t>
+            </w:r>
+          </w:p>
+        </w:tc>
+      </w:tr>
+    </w:tbl>
+    <w:p>
+      <w:pPr>
+        <w:pStyle w:val="Heading1"/>
+      </w:pPr>
+      <w:r>
+        <w:t>Prior fixes on main</w:t>
+      </w:r>
+    </w:p>
+    <w:p>
+      <w:pPr>
+        <w:pStyle w:val="ListBullet"/>
+      </w:pPr>
+      <w:r>
+        <w:t>876bcd2: manual edit, merge fields, planner mock row, disclaimer persist, sync fixes.</w:t>
+      </w:r>
+    </w:p>
+    <w:p>
+      <w:pPr>
+        <w:pStyle w:val="ListBullet"/>
+      </w:pPr>
+      <w:r>
+        <w:t>db72dce: ascent gauge imperial, 7 App Shortcuts, shortcut help, detail refresh.</w:t>
+      </w:r>
+    </w:p>
+    <w:p>
+      <w:pPr>
+        <w:pStyle w:val="Heading1"/>
+      </w:pPr>
+      <w:r>
+        <w:t>Reference UI</w:t>
       </w:r>
     </w:p>
     <w:p>
@@ -307,16 +1856,16 @@
       <w:r>
         <w:rPr>
           <w:b w:val="0"/>
-          <w:sz w:val="20"/>
+          <w:sz w:val="18"/>
         </w:rPr>
-        <w:t>Watch reference: Watch_LIVE_reference.png</w:t>
+        <w:t>Watch LIVE reference</w:t>
       </w:r>
     </w:p>
     <w:p>
       <w:r>
         <w:drawing>
           <wp:inline xmlns:a="http://schemas.openxmlformats.org/drawingml/2006/main" xmlns:pic="http://schemas.openxmlformats.org/drawingml/2006/picture">
-            <wp:extent cx="2560320" cy="1705213"/>
+            <wp:extent cx="2011680" cy="1339810"/>
             <wp:docPr id="2" name="Picture 2"/>
             <wp:cNvGraphicFramePr>
               <a:graphicFrameLocks noChangeAspect="1"/>
@@ -337,7 +1886,7 @@
                   <pic:spPr>
                     <a:xfrm>
                       <a:off x="0" y="0"/>
-                      <a:ext cx="2560320" cy="1705213"/>
+                      <a:ext cx="2011680" cy="1339810"/>
                     </a:xfrm>
                     <a:prstGeom prst="rect"/>
                   </pic:spPr>
@@ -352,1310 +1901,18 @@
       <w:r>
         <w:rPr>
           <w:b w:val="0"/>
-          <w:sz w:val="20"/>
+          <w:sz w:val="18"/>
         </w:rPr>
-        <w:t>iOS reference: iOS_Companion_reference.png</w:t>
-      </w:r>
-    </w:p>
-    <w:p>
-      <w:pPr>
-        <w:pStyle w:val="Heading1"/>
-      </w:pPr>
-      <w:r>
-        <w:t>C. Feature Inventory (summary)</w:t>
-      </w:r>
-    </w:p>
-    <w:tbl>
-      <w:tblPr>
-        <w:tblStyle w:val="TableGrid"/>
-        <w:tblW w:type="auto" w:w="0"/>
-        <w:tblLook w:firstColumn="1" w:firstRow="1" w:lastColumn="0" w:lastRow="0" w:noHBand="0" w:noVBand="1" w:val="04A0"/>
-      </w:tblPr>
-      <w:tblGrid>
-        <w:gridCol w:w="1728"/>
-        <w:gridCol w:w="1728"/>
-        <w:gridCol w:w="1728"/>
-        <w:gridCol w:w="1728"/>
-        <w:gridCol w:w="1728"/>
-      </w:tblGrid>
-      <w:tr>
-        <w:tc>
-          <w:tcPr>
-            <w:tcW w:type="dxa" w:w="1728"/>
-          </w:tcPr>
-          <w:p>
-            <w:r>
-              <w:t>Platform</w:t>
-            </w:r>
-          </w:p>
-        </w:tc>
-        <w:tc>
-          <w:tcPr>
-            <w:tcW w:type="dxa" w:w="1728"/>
-          </w:tcPr>
-          <w:p>
-            <w:r>
-              <w:t>Feature</w:t>
-            </w:r>
-          </w:p>
-        </w:tc>
-        <w:tc>
-          <w:tcPr>
-            <w:tcW w:type="dxa" w:w="1728"/>
-          </w:tcPr>
-          <w:p>
-            <w:r>
-              <w:t>Complete</w:t>
-            </w:r>
-          </w:p>
-        </w:tc>
-        <w:tc>
-          <w:tcPr>
-            <w:tcW w:type="dxa" w:w="1728"/>
-          </w:tcPr>
-          <w:p>
-            <w:r>
-              <w:t>Severity</w:t>
-            </w:r>
-          </w:p>
-        </w:tc>
-        <w:tc>
-          <w:tcPr>
-            <w:tcW w:type="dxa" w:w="1728"/>
-          </w:tcPr>
-          <w:p>
-            <w:r>
-              <w:t>Notes</w:t>
-            </w:r>
-          </w:p>
-        </w:tc>
-      </w:tr>
-      <w:tr>
-        <w:tc>
-          <w:tcPr>
-            <w:tcW w:type="dxa" w:w="1728"/>
-          </w:tcPr>
-          <w:p>
-            <w:r>
-              <w:t>Watch</w:t>
-            </w:r>
-          </w:p>
-        </w:tc>
-        <w:tc>
-          <w:tcPr>
-            <w:tcW w:type="dxa" w:w="1728"/>
-          </w:tcPr>
-          <w:p>
-            <w:r>
-              <w:t>Live dive + ascent banner</w:t>
-            </w:r>
-          </w:p>
-        </w:tc>
-        <w:tc>
-          <w:tcPr>
-            <w:tcW w:type="dxa" w:w="1728"/>
-          </w:tcPr>
-          <w:p>
-            <w:r>
-              <w:t>Y</w:t>
-            </w:r>
-          </w:p>
-        </w:tc>
-        <w:tc>
-          <w:tcPr>
-            <w:tcW w:type="dxa" w:w="1728"/>
-          </w:tcPr>
-          <w:p>
-            <w:r>
-              <w:t>—</w:t>
-            </w:r>
-          </w:p>
-        </w:tc>
-        <w:tc>
-          <w:tcPr>
-            <w:tcW w:type="dxa" w:w="1728"/>
-          </w:tcPr>
-          <w:p>
-            <w:r>
-              <w:t>Inline banner; gauge visible</w:t>
-            </w:r>
-          </w:p>
-        </w:tc>
-      </w:tr>
-      <w:tr>
-        <w:tc>
-          <w:tcPr>
-            <w:tcW w:type="dxa" w:w="1728"/>
-          </w:tcPr>
-          <w:p>
-            <w:r>
-              <w:t>Watch</w:t>
-            </w:r>
-          </w:p>
-        </w:tc>
-        <w:tc>
-          <w:tcPr>
-            <w:tcW w:type="dxa" w:w="1728"/>
-          </w:tcPr>
-          <w:p>
-            <w:r>
-              <w:t>BUSSOLA / bearing</w:t>
-            </w:r>
-          </w:p>
-        </w:tc>
-        <w:tc>
-          <w:tcPr>
-            <w:tcW w:type="dxa" w:w="1728"/>
-          </w:tcPr>
-          <w:p>
-            <w:r>
-              <w:t>Y</w:t>
-            </w:r>
-          </w:p>
-        </w:tc>
-        <w:tc>
-          <w:tcPr>
-            <w:tcW w:type="dxa" w:w="1728"/>
-          </w:tcPr>
-          <w:p>
-            <w:r>
-              <w:t>—</w:t>
-            </w:r>
-          </w:p>
-        </w:tc>
-        <w:tc>
-          <w:tcPr>
-            <w:tcW w:type="dxa" w:w="1728"/>
-          </w:tcPr>
-          <w:p>
-            <w:r>
-              <w:t>BUSSOLA terminology</w:t>
-            </w:r>
-          </w:p>
-        </w:tc>
-      </w:tr>
-      <w:tr>
-        <w:tc>
-          <w:tcPr>
-            <w:tcW w:type="dxa" w:w="1728"/>
-          </w:tcPr>
-          <w:p>
-            <w:r>
-              <w:t>Watch</w:t>
-            </w:r>
-          </w:p>
-        </w:tc>
-        <w:tc>
-          <w:tcPr>
-            <w:tcW w:type="dxa" w:w="1728"/>
-          </w:tcPr>
-          <w:p>
-            <w:r>
-              <w:t>GPS start/end</w:t>
-            </w:r>
-          </w:p>
-        </w:tc>
-        <w:tc>
-          <w:tcPr>
-            <w:tcW w:type="dxa" w:w="1728"/>
-          </w:tcPr>
-          <w:p>
-            <w:r>
-              <w:t>Y</w:t>
-            </w:r>
-          </w:p>
-        </w:tc>
-        <w:tc>
-          <w:tcPr>
-            <w:tcW w:type="dxa" w:w="1728"/>
-          </w:tcPr>
-          <w:p>
-            <w:r>
-              <w:t>—</w:t>
-            </w:r>
-          </w:p>
-        </w:tc>
-        <w:tc>
-          <w:tcPr>
-            <w:tcW w:type="dxa" w:w="1728"/>
-          </w:tcPr>
-          <w:p>
-            <w:r>
-              <w:t>Compact banner ~1.4s (a75a6c3)</w:t>
-            </w:r>
-          </w:p>
-        </w:tc>
-      </w:tr>
-      <w:tr>
-        <w:tc>
-          <w:tcPr>
-            <w:tcW w:type="dxa" w:w="1728"/>
-          </w:tcPr>
-          <w:p>
-            <w:r>
-              <w:t>Watch</w:t>
-            </w:r>
-          </w:p>
-        </w:tc>
-        <w:tc>
-          <w:tcPr>
-            <w:tcW w:type="dxa" w:w="1728"/>
-          </w:tcPr>
-          <w:p>
-            <w:r>
-              <w:t>iPhone → Watch sync</w:t>
-            </w:r>
-          </w:p>
-        </w:tc>
-        <w:tc>
-          <w:tcPr>
-            <w:tcW w:type="dxa" w:w="1728"/>
-          </w:tcPr>
-          <w:p>
-            <w:r>
-              <w:t>Partial</w:t>
-            </w:r>
-          </w:p>
-        </w:tc>
-        <w:tc>
-          <w:tcPr>
-            <w:tcW w:type="dxa" w:w="1728"/>
-          </w:tcPr>
-          <w:p>
-            <w:r>
-              <w:t>MED</w:t>
-            </w:r>
-          </w:p>
-        </w:tc>
-        <w:tc>
-          <w:tcPr>
-            <w:tcW w:type="dxa" w:w="1728"/>
-          </w:tcPr>
-          <w:p>
-            <w:r>
-              <w:t>didReceive* implemented; device QA needed</w:t>
-            </w:r>
-          </w:p>
-        </w:tc>
-      </w:tr>
-      <w:tr>
-        <w:tc>
-          <w:tcPr>
-            <w:tcW w:type="dxa" w:w="1728"/>
-          </w:tcPr>
-          <w:p>
-            <w:r>
-              <w:t>Watch</w:t>
-            </w:r>
-          </w:p>
-        </w:tc>
-        <w:tc>
-          <w:tcPr>
-            <w:tcW w:type="dxa" w:w="1728"/>
-          </w:tcPr>
-          <w:p>
-            <w:r>
-              <w:t>Alarm dismiss OK</w:t>
-            </w:r>
-          </w:p>
-        </w:tc>
-        <w:tc>
-          <w:tcPr>
-            <w:tcW w:type="dxa" w:w="1728"/>
-          </w:tcPr>
-          <w:p>
-            <w:r>
-              <w:t>Y</w:t>
-            </w:r>
-          </w:p>
-        </w:tc>
-        <w:tc>
-          <w:tcPr>
-            <w:tcW w:type="dxa" w:w="1728"/>
-          </w:tcPr>
-          <w:p>
-            <w:r>
-              <w:t>—</w:t>
-            </w:r>
-          </w:p>
-        </w:tc>
-        <w:tc>
-          <w:tcPr>
-            <w:tcW w:type="dxa" w:w="1728"/>
-          </w:tcPr>
-          <w:p>
-            <w:r>
-              <w:t>15s cooldown</w:t>
-            </w:r>
-          </w:p>
-        </w:tc>
-      </w:tr>
-      <w:tr>
-        <w:tc>
-          <w:tcPr>
-            <w:tcW w:type="dxa" w:w="1728"/>
-          </w:tcPr>
-          <w:p>
-            <w:r>
-              <w:t>iOS</w:t>
-            </w:r>
-          </w:p>
-        </w:tc>
-        <w:tc>
-          <w:tcPr>
-            <w:tcW w:type="dxa" w:w="1728"/>
-          </w:tcPr>
-          <w:p>
-            <w:r>
-              <w:t>Logbook / detail / export</w:t>
-            </w:r>
-          </w:p>
-        </w:tc>
-        <w:tc>
-          <w:tcPr>
-            <w:tcW w:type="dxa" w:w="1728"/>
-          </w:tcPr>
-          <w:p>
-            <w:r>
-              <w:t>Y</w:t>
-            </w:r>
-          </w:p>
-        </w:tc>
-        <w:tc>
-          <w:tcPr>
-            <w:tcW w:type="dxa" w:w="1728"/>
-          </w:tcPr>
-          <w:p>
-            <w:r>
-              <w:t>—</w:t>
-            </w:r>
-          </w:p>
-        </w:tc>
-        <w:tc>
-          <w:tcPr>
-            <w:tcW w:type="dxa" w:w="1728"/>
-          </w:tcPr>
-          <w:p>
-            <w:r/>
-          </w:p>
-        </w:tc>
-      </w:tr>
-      <w:tr>
-        <w:tc>
-          <w:tcPr>
-            <w:tcW w:type="dxa" w:w="1728"/>
-          </w:tcPr>
-          <w:p>
-            <w:r>
-              <w:t>iOS</w:t>
-            </w:r>
-          </w:p>
-        </w:tc>
-        <w:tc>
-          <w:tcPr>
-            <w:tcW w:type="dxa" w:w="1728"/>
-          </w:tcPr>
-          <w:p>
-            <w:r>
-              <w:t>Planner + Bühlmann</w:t>
-            </w:r>
-          </w:p>
-        </w:tc>
-        <w:tc>
-          <w:tcPr>
-            <w:tcW w:type="dxa" w:w="1728"/>
-          </w:tcPr>
-          <w:p>
-            <w:r>
-              <w:t>Partial</w:t>
-            </w:r>
-          </w:p>
-        </w:tc>
-        <w:tc>
-          <w:tcPr>
-            <w:tcW w:type="dxa" w:w="1728"/>
-          </w:tcPr>
-          <w:p>
-            <w:r>
-              <w:t>MED</w:t>
-            </w:r>
-          </w:p>
-        </w:tc>
-        <w:tc>
-          <w:tcPr>
-            <w:tcW w:type="dxa" w:w="1728"/>
-          </w:tcPr>
-          <w:p>
-            <w:r>
-              <w:t>Indicative disclaimer</w:t>
-            </w:r>
-          </w:p>
-        </w:tc>
-      </w:tr>
-      <w:tr>
-        <w:tc>
-          <w:tcPr>
-            <w:tcW w:type="dxa" w:w="1728"/>
-          </w:tcPr>
-          <w:p>
-            <w:r>
-              <w:t>iOS</w:t>
-            </w:r>
-          </w:p>
-        </w:tc>
-        <w:tc>
-          <w:tcPr>
-            <w:tcW w:type="dxa" w:w="1728"/>
-          </w:tcPr>
-          <w:p>
-            <w:r>
-              <w:t>Watch import + tombstone</w:t>
-            </w:r>
-          </w:p>
-        </w:tc>
-        <w:tc>
-          <w:tcPr>
-            <w:tcW w:type="dxa" w:w="1728"/>
-          </w:tcPr>
-          <w:p>
-            <w:r>
-              <w:t>Partial</w:t>
-            </w:r>
-          </w:p>
-        </w:tc>
-        <w:tc>
-          <w:tcPr>
-            <w:tcW w:type="dxa" w:w="1728"/>
-          </w:tcPr>
-          <w:p>
-            <w:r>
-              <w:t>MED</w:t>
-            </w:r>
-          </w:p>
-        </w:tc>
-        <w:tc>
-          <w:tcPr>
-            <w:tcW w:type="dxa" w:w="1728"/>
-          </w:tcPr>
-          <w:p>
-            <w:r>
-              <w:t>Shared key; QA on device</w:t>
-            </w:r>
-          </w:p>
-        </w:tc>
-      </w:tr>
-      <w:tr>
-        <w:tc>
-          <w:tcPr>
-            <w:tcW w:type="dxa" w:w="1728"/>
-          </w:tcPr>
-          <w:p>
-            <w:r>
-              <w:t>Both</w:t>
-            </w:r>
-          </w:p>
-        </w:tc>
-        <w:tc>
-          <w:tcPr>
-            <w:tcW w:type="dxa" w:w="1728"/>
-          </w:tcPr>
-          <w:p>
-            <w:r>
-              <w:t>Secondary i18n</w:t>
-            </w:r>
-          </w:p>
-        </w:tc>
-        <w:tc>
-          <w:tcPr>
-            <w:tcW w:type="dxa" w:w="1728"/>
-          </w:tcPr>
-          <w:p>
-            <w:r>
-              <w:t>Partial</w:t>
-            </w:r>
-          </w:p>
-        </w:tc>
-        <w:tc>
-          <w:tcPr>
-            <w:tcW w:type="dxa" w:w="1728"/>
-          </w:tcPr>
-          <w:p>
-            <w:r>
-              <w:t>LOW</w:t>
-            </w:r>
-          </w:p>
-        </w:tc>
-        <w:tc>
-          <w:tcPr>
-            <w:tcW w:type="dxa" w:w="1728"/>
-          </w:tcPr>
-          <w:p>
-            <w:r>
-              <w:t>~240 EN keys; planner gaps remain</w:t>
-            </w:r>
-          </w:p>
-        </w:tc>
-      </w:tr>
-    </w:tbl>
-    <w:p>
-      <w:pPr>
-        <w:pStyle w:val="Heading1"/>
-      </w:pPr>
-      <w:r>
-        <w:t>D. Navigation Map</w:t>
-      </w:r>
-    </w:p>
-    <w:p>
-      <w:r>
-        <w:rPr>
-          <w:b/>
-          <w:sz w:val="20"/>
-        </w:rPr>
-        <w:t>Watch: Mode Selection → Live; tabs: Mode | Live | BUSSOLA | Settings | Images | Log.</w:t>
-      </w:r>
-    </w:p>
-    <w:p>
-      <w:r>
-        <w:rPr>
-          <w:b/>
-          <w:sz w:val="20"/>
-        </w:rPr>
-        <w:t>iOS: Logbook | Analisi | Planner | Attrezzatura | Altro.</w:t>
-      </w:r>
-    </w:p>
-    <w:p>
-      <w:pPr>
-        <w:pStyle w:val="Heading1"/>
-      </w:pPr>
-      <w:r>
-        <w:t>E. UI Consistency</w:t>
-      </w:r>
-    </w:p>
-    <w:p>
-      <w:pPr>
-        <w:pStyle w:val="ListBullet"/>
-      </w:pPr>
-      <w:r>
-        <w:t>Watch: high match to black/neon DiveUI; GPS now compact banner (aligned with reference intent).</w:t>
-      </w:r>
-    </w:p>
-    <w:p>
-      <w:pPr>
-        <w:pStyle w:val="ListBullet"/>
-      </w:pPr>
-      <w:r>
-        <w:t>iOS: high match to DIRTheme dark marine + cyan; verify AppIcon in Xcode archive.</w:t>
-      </w:r>
-    </w:p>
-    <w:p>
-      <w:pPr>
-        <w:pStyle w:val="ListBullet"/>
-      </w:pPr>
-      <w:r>
-        <w:t>i18n: improved secondary pass; residual IT on planner/GPS detail possible.</w:t>
-      </w:r>
-    </w:p>
-    <w:p>
-      <w:pPr>
-        <w:pStyle w:val="Heading1"/>
-      </w:pPr>
-      <w:r>
-        <w:t>F. Settings</w:t>
-      </w:r>
-    </w:p>
-    <w:p>
-      <w:pPr>
-        <w:pStyle w:val="ListBullet"/>
-      </w:pPr>
-      <w:r>
-        <w:t>Watch: ascent limits, alarms, haptics, language — persisted; settings sync to iPhone planned only.</w:t>
-      </w:r>
-    </w:p>
-    <w:p>
-      <w:pPr>
-        <w:pStyle w:val="ListBullet"/>
-      </w:pPr>
-      <w:r>
-        <w:t>iOS: language editable; units/export read-only; cloud sync trigger; demo logbook for review.</w:t>
-      </w:r>
-    </w:p>
-    <w:p>
-      <w:pPr>
-        <w:pStyle w:val="Heading1"/>
-      </w:pPr>
-      <w:r>
-        <w:t>G. Haptics / Tones</w:t>
-      </w:r>
-    </w:p>
-    <w:p>
-      <w:pPr>
-        <w:pStyle w:val="ListBullet"/>
-      </w:pPr>
-      <w:r>
-        <w:t>Watch: haptics for stopwatch, ascent alarm, alarms, compass, export — gated by toggle.</w:t>
-      </w:r>
-    </w:p>
-    <w:p>
-      <w:pPr>
-        <w:pStyle w:val="ListBullet"/>
-      </w:pPr>
-      <w:r>
-        <w:t>Watch: alarm OK dismiss on live screen (SAF-8 fixed).</w:t>
-      </w:r>
-    </w:p>
-    <w:p>
-      <w:pPr>
-        <w:pStyle w:val="ListBullet"/>
-      </w:pPr>
-      <w:r>
-        <w:t>iOS: no alert sounds; visual feedback only.</w:t>
-      </w:r>
-    </w:p>
-    <w:p>
-      <w:pPr>
-        <w:pStyle w:val="Heading1"/>
-      </w:pPr>
-      <w:r>
-        <w:t>H. Hardware</w:t>
+        <w:t>iOS Companion reference</w:t>
       </w:r>
     </w:p>
     <w:p>
       <w:r>
         <w:rPr>
           <w:b w:val="0"/>
-          <w:sz w:val="20"/>
-        </w:rPr>
-        <w:t>App Intents: manual dive, bearing, alarm acknowledge, stopwatch. Side button not mapped (documented in WatchShortcutHelpView).</w:t>
-      </w:r>
-    </w:p>
-    <w:p>
-      <w:pPr>
-        <w:pStyle w:val="Heading1"/>
-      </w:pPr>
-      <w:r>
-        <w:t>I. Sync</w:t>
-      </w:r>
-    </w:p>
-    <w:p>
-      <w:pPr>
-        <w:pStyle w:val="ListBullet"/>
-      </w:pPr>
-      <w:r>
-        <w:t>FIXED: Watch didReceiveMessage / didReceiveUserInfo (a75a6c3).</w:t>
-      </w:r>
-    </w:p>
-    <w:p>
-      <w:pPr>
-        <w:pStyle w:val="ListBullet"/>
-      </w:pPr>
-      <w:r>
-        <w:t>FIXED: dirdiving_shared_deleted_session_ids + WC tombstone broadcast.</w:t>
-      </w:r>
-    </w:p>
-    <w:p>
-      <w:pPr>
-        <w:pStyle w:val="ListBullet"/>
-      </w:pPr>
-      <w:r>
-        <w:t>Watch → iPhone outbound queue + signed ack implemented.</w:t>
-      </w:r>
-    </w:p>
-    <w:p>
-      <w:pPr>
-        <w:pStyle w:val="ListBullet"/>
-      </w:pPr>
-      <w:r>
-        <w:t>REMAINING: first-pairing education; per-session delivery UI; physical QA.</w:t>
-      </w:r>
-    </w:p>
-    <w:p>
-      <w:pPr>
-        <w:pStyle w:val="Heading1"/>
-      </w:pPr>
-      <w:r>
-        <w:t>J. Export</w:t>
-      </w:r>
-    </w:p>
-    <w:p>
-      <w:r>
-        <w:rPr>
-          <w:b w:val="0"/>
-          <w:sz w:val="20"/>
-        </w:rPr>
-        <w:t>Subsurface CSV on Watch and iOS; GPX/KML not on MAIN. Share/error feedback present.</w:t>
-      </w:r>
-    </w:p>
-    <w:p>
-      <w:pPr>
-        <w:pStyle w:val="Heading1"/>
-      </w:pPr>
-      <w:r>
-        <w:t>K. Safety</w:t>
-      </w:r>
-    </w:p>
-    <w:p>
-      <w:pPr>
-        <w:pStyle w:val="ListBullet"/>
-      </w:pPr>
-      <w:r>
-        <w:t>Not presented as certified dive computer.</w:t>
-      </w:r>
-    </w:p>
-    <w:p>
-      <w:pPr>
-        <w:pStyle w:val="ListBullet"/>
-      </w:pPr>
-      <w:r>
-        <w:t>Planner and TTV marked indicative in UI/README/More.</w:t>
-      </w:r>
-    </w:p>
-    <w:p>
-      <w:pPr>
-        <w:pStyle w:val="ListBullet"/>
-      </w:pPr>
-      <w:r>
-        <w:t>Water submersion entitlement configured; real Ultra validation still required.</w:t>
-      </w:r>
-    </w:p>
-    <w:p>
-      <w:pPr>
-        <w:pStyle w:val="Heading1"/>
-      </w:pPr>
-      <w:r>
-        <w:t>L. Error / Empty states</w:t>
-      </w:r>
-    </w:p>
-    <w:p>
-      <w:r>
-        <w:rPr>
-          <w:b w:val="0"/>
-          <w:sz w:val="20"/>
-        </w:rPr>
-        <w:t>Logbook and Analysis empty states with real actions (import, sync). GPS/depth failures labeled.</w:t>
-      </w:r>
-    </w:p>
-    <w:p>
-      <w:pPr>
-        <w:pStyle w:val="Heading1"/>
-      </w:pPr>
-      <w:r>
-        <w:t>M. Bugs To Fix (top)</w:t>
-      </w:r>
-    </w:p>
-    <w:tbl>
-      <w:tblPr>
-        <w:tblStyle w:val="TableGrid"/>
-        <w:tblW w:type="auto" w:w="0"/>
-        <w:tblLook w:firstColumn="1" w:firstRow="1" w:lastColumn="0" w:lastRow="0" w:noHBand="0" w:noVBand="1" w:val="04A0"/>
-      </w:tblPr>
-      <w:tblGrid>
-        <w:gridCol w:w="2160"/>
-        <w:gridCol w:w="2160"/>
-        <w:gridCol w:w="2160"/>
-        <w:gridCol w:w="2160"/>
-      </w:tblGrid>
-      <w:tr>
-        <w:tc>
-          <w:tcPr>
-            <w:tcW w:type="dxa" w:w="2160"/>
-          </w:tcPr>
-          <w:p>
-            <w:r>
-              <w:t>#</w:t>
-            </w:r>
-          </w:p>
-        </w:tc>
-        <w:tc>
-          <w:tcPr>
-            <w:tcW w:type="dxa" w:w="2160"/>
-          </w:tcPr>
-          <w:p>
-            <w:r>
-              <w:t>Title</w:t>
-            </w:r>
-          </w:p>
-        </w:tc>
-        <w:tc>
-          <w:tcPr>
-            <w:tcW w:type="dxa" w:w="2160"/>
-          </w:tcPr>
-          <w:p>
-            <w:r>
-              <w:t>Sev.</w:t>
-            </w:r>
-          </w:p>
-        </w:tc>
-        <w:tc>
-          <w:tcPr>
-            <w:tcW w:type="dxa" w:w="2160"/>
-          </w:tcPr>
-          <w:p>
-            <w:r>
-              <w:t>Fix type</w:t>
-            </w:r>
-          </w:p>
-        </w:tc>
-      </w:tr>
-      <w:tr>
-        <w:tc>
-          <w:tcPr>
-            <w:tcW w:type="dxa" w:w="2160"/>
-          </w:tcPr>
-          <w:p>
-            <w:r>
-              <w:t>1</w:t>
-            </w:r>
-          </w:p>
-        </w:tc>
-        <w:tc>
-          <w:tcPr>
-            <w:tcW w:type="dxa" w:w="2160"/>
-          </w:tcPr>
-          <w:p>
-            <w:r>
-              <w:t>Depth entitlement not validated on real Ultra</w:t>
-            </w:r>
-          </w:p>
-        </w:tc>
-        <w:tc>
-          <w:tcPr>
-            <w:tcW w:type="dxa" w:w="2160"/>
-          </w:tcPr>
-          <w:p>
-            <w:r>
-              <w:t>HIGH</w:t>
-            </w:r>
-          </w:p>
-        </w:tc>
-        <w:tc>
-          <w:tcPr>
-            <w:tcW w:type="dxa" w:w="2160"/>
-          </w:tcPr>
-          <w:p>
-            <w:r>
-              <w:t>Process / QA</w:t>
-            </w:r>
-          </w:p>
-        </w:tc>
-      </w:tr>
-      <w:tr>
-        <w:tc>
-          <w:tcPr>
-            <w:tcW w:type="dxa" w:w="2160"/>
-          </w:tcPr>
-          <w:p>
-            <w:r>
-              <w:t>2</w:t>
-            </w:r>
-          </w:p>
-        </w:tc>
-        <w:tc>
-          <w:tcPr>
-            <w:tcW w:type="dxa" w:w="2160"/>
-          </w:tcPr>
-          <w:p>
-            <w:r>
-              <w:t>First-pairing sync appears broken without docs</w:t>
-            </w:r>
-          </w:p>
-        </w:tc>
-        <w:tc>
-          <w:tcPr>
-            <w:tcW w:type="dxa" w:w="2160"/>
-          </w:tcPr>
-          <w:p>
-            <w:r>
-              <w:t>MED</w:t>
-            </w:r>
-          </w:p>
-        </w:tc>
-        <w:tc>
-          <w:tcPr>
-            <w:tcW w:type="dxa" w:w="2160"/>
-          </w:tcPr>
-          <w:p>
-            <w:r>
-              <w:t>Process + copy</w:t>
-            </w:r>
-          </w:p>
-        </w:tc>
-      </w:tr>
-      <w:tr>
-        <w:tc>
-          <w:tcPr>
-            <w:tcW w:type="dxa" w:w="2160"/>
-          </w:tcPr>
-          <w:p>
-            <w:r>
-              <w:t>3</w:t>
-            </w:r>
-          </w:p>
-        </w:tc>
-        <w:tc>
-          <w:tcPr>
-            <w:tcW w:type="dxa" w:w="2160"/>
-          </w:tcPr>
-          <w:p>
-            <w:r>
-              <w:t>Mode Selection extra launch step</w:t>
-            </w:r>
-          </w:p>
-        </w:tc>
-        <w:tc>
-          <w:tcPr>
-            <w:tcW w:type="dxa" w:w="2160"/>
-          </w:tcPr>
-          <w:p>
-            <w:r>
-              <w:t>LOW</w:t>
-            </w:r>
-          </w:p>
-        </w:tc>
-        <w:tc>
-          <w:tcPr>
-            <w:tcW w:type="dxa" w:w="2160"/>
-          </w:tcPr>
-          <w:p>
-            <w:r>
-              <w:t>UI-only</w:t>
-            </w:r>
-          </w:p>
-        </w:tc>
-      </w:tr>
-      <w:tr>
-        <w:tc>
-          <w:tcPr>
-            <w:tcW w:type="dxa" w:w="2160"/>
-          </w:tcPr>
-          <w:p>
-            <w:r>
-              <w:t>4</w:t>
-            </w:r>
-          </w:p>
-        </w:tc>
-        <w:tc>
-          <w:tcPr>
-            <w:tcW w:type="dxa" w:w="2160"/>
-          </w:tcPr>
-          <w:p>
-            <w:r>
-              <w:t>UserImages tab when bundle empty</w:t>
-            </w:r>
-          </w:p>
-        </w:tc>
-        <w:tc>
-          <w:tcPr>
-            <w:tcW w:type="dxa" w:w="2160"/>
-          </w:tcPr>
-          <w:p>
-            <w:r>
-              <w:t>LOW</w:t>
-            </w:r>
-          </w:p>
-        </w:tc>
-        <w:tc>
-          <w:tcPr>
-            <w:tcW w:type="dxa" w:w="2160"/>
-          </w:tcPr>
-          <w:p>
-            <w:r>
-              <w:t>UI-only</w:t>
-            </w:r>
-          </w:p>
-        </w:tc>
-      </w:tr>
-      <w:tr>
-        <w:tc>
-          <w:tcPr>
-            <w:tcW w:type="dxa" w:w="2160"/>
-          </w:tcPr>
-          <w:p>
-            <w:r>
-              <w:t>5</w:t>
-            </w:r>
-          </w:p>
-        </w:tc>
-        <w:tc>
-          <w:tcPr>
-            <w:tcW w:type="dxa" w:w="2160"/>
-          </w:tcPr>
-          <w:p>
-            <w:r>
-              <w:t>Residual i18n planner/GPS detail</w:t>
-            </w:r>
-          </w:p>
-        </w:tc>
-        <w:tc>
-          <w:tcPr>
-            <w:tcW w:type="dxa" w:w="2160"/>
-          </w:tcPr>
-          <w:p>
-            <w:r>
-              <w:t>LOW</w:t>
-            </w:r>
-          </w:p>
-        </w:tc>
-        <w:tc>
-          <w:tcPr>
-            <w:tcW w:type="dxa" w:w="2160"/>
-          </w:tcPr>
-          <w:p>
-            <w:r>
-              <w:t>UI-only</w:t>
-            </w:r>
-          </w:p>
-        </w:tc>
-      </w:tr>
-      <w:tr>
-        <w:tc>
-          <w:tcPr>
-            <w:tcW w:type="dxa" w:w="2160"/>
-          </w:tcPr>
-          <w:p>
-            <w:r>
-              <w:t>6</w:t>
-            </w:r>
-          </w:p>
-        </w:tc>
-        <w:tc>
-          <w:tcPr>
-            <w:tcW w:type="dxa" w:w="2160"/>
-          </w:tcPr>
-          <w:p>
-            <w:r>
-              <w:t>iOS AppIcon archive completeness</w:t>
-            </w:r>
-          </w:p>
-        </w:tc>
-        <w:tc>
-          <w:tcPr>
-            <w:tcW w:type="dxa" w:w="2160"/>
-          </w:tcPr>
-          <w:p>
-            <w:r>
-              <w:t>MED</w:t>
-            </w:r>
-          </w:p>
-        </w:tc>
-        <w:tc>
-          <w:tcPr>
-            <w:tcW w:type="dxa" w:w="2160"/>
-          </w:tcPr>
-          <w:p>
-            <w:r>
-              <w:t>Assets</w:t>
-            </w:r>
-          </w:p>
-        </w:tc>
-      </w:tr>
-    </w:tbl>
-    <w:p>
-      <w:r>
-        <w:rPr>
-          <w:b/>
-          <w:sz w:val="20"/>
-        </w:rPr>
-        <w:t>Resolved: Watch inbound WC, tombstones, GPS banner, alarm dismiss, simulator builds.</w:t>
-      </w:r>
-    </w:p>
-    <w:p>
-      <w:pPr>
-        <w:pStyle w:val="Heading1"/>
-      </w:pPr>
-      <w:r>
-        <w:t>N. Priority Roadmap</w:t>
-      </w:r>
-    </w:p>
-    <w:p>
-      <w:pPr>
-        <w:pStyle w:val="ListBullet"/>
-      </w:pPr>
-      <w:r>
-        <w:t>Before compile/use: simulator builds OK; verify signing + entitlements on portal.</w:t>
-      </w:r>
-    </w:p>
-    <w:p>
-      <w:pPr>
-        <w:pStyle w:val="ListBullet"/>
-      </w:pPr>
-      <w:r>
-        <w:t>Before TestFlight: Ultra depth smoke test + bidirectional sync on physical devices.</w:t>
-      </w:r>
-    </w:p>
-    <w:p>
-      <w:pPr>
-        <w:pStyle w:val="ListBullet"/>
-      </w:pPr>
-      <w:r>
-        <w:t>Before App Store: legal/privacy, primary-flow i18n, App icon/screenshots.</w:t>
-      </w:r>
-    </w:p>
-    <w:p>
-      <w:pPr>
-        <w:pStyle w:val="ListBullet"/>
-      </w:pPr>
-      <w:r>
-        <w:t>Post-release: skip Mode Selection, hide empty UserImages, GPX, settings sync.</w:t>
-      </w:r>
-    </w:p>
-    <w:p>
-      <w:pPr>
-        <w:pStyle w:val="Heading1"/>
-      </w:pPr>
-      <w:r>
-        <w:t>O. Final Verdict</w:t>
-      </w:r>
-    </w:p>
-    <w:tbl>
-      <w:tblPr>
-        <w:tblStyle w:val="TableGrid"/>
-        <w:tblW w:type="auto" w:w="0"/>
-        <w:tblLook w:firstColumn="1" w:firstRow="1" w:lastColumn="0" w:lastRow="0" w:noHBand="0" w:noVBand="1" w:val="04A0"/>
-      </w:tblPr>
-      <w:tblGrid>
-        <w:gridCol w:w="4320"/>
-        <w:gridCol w:w="4320"/>
-      </w:tblGrid>
-      <w:tr>
-        <w:tc>
-          <w:tcPr>
-            <w:tcW w:type="dxa" w:w="4320"/>
-          </w:tcPr>
-          <w:p>
-            <w:r>
-              <w:t>Question</w:t>
-            </w:r>
-          </w:p>
-        </w:tc>
-        <w:tc>
-          <w:tcPr>
-            <w:tcW w:type="dxa" w:w="4320"/>
-          </w:tcPr>
-          <w:p>
-            <w:r>
-              <w:t>Answer</w:t>
-            </w:r>
-          </w:p>
-        </w:tc>
-      </w:tr>
-      <w:tr>
-        <w:tc>
-          <w:tcPr>
-            <w:tcW w:type="dxa" w:w="4320"/>
-          </w:tcPr>
-          <w:p>
-            <w:r>
-              <w:t>Ready to compile?</w:t>
-            </w:r>
-          </w:p>
-        </w:tc>
-        <w:tc>
-          <w:tcPr>
-            <w:tcW w:type="dxa" w:w="4320"/>
-          </w:tcPr>
-          <w:p>
-            <w:r>
-              <w:t>Yes (simulator builds succeeded)</w:t>
-            </w:r>
-          </w:p>
-        </w:tc>
-      </w:tr>
-      <w:tr>
-        <w:tc>
-          <w:tcPr>
-            <w:tcW w:type="dxa" w:w="4320"/>
-          </w:tcPr>
-          <w:p>
-            <w:r>
-              <w:t>Ready for internal test?</w:t>
-            </w:r>
-          </w:p>
-        </w:tc>
-        <w:tc>
-          <w:tcPr>
-            <w:tcW w:type="dxa" w:w="4320"/>
-          </w:tcPr>
-          <w:p>
-            <w:r>
-              <w:t>Yes with pairing checklist</w:t>
-            </w:r>
-          </w:p>
-        </w:tc>
-      </w:tr>
-      <w:tr>
-        <w:tc>
-          <w:tcPr>
-            <w:tcW w:type="dxa" w:w="4320"/>
-          </w:tcPr>
-          <w:p>
-            <w:r>
-              <w:t>Ready for average user?</w:t>
-            </w:r>
-          </w:p>
-        </w:tc>
-        <w:tc>
-          <w:tcPr>
-            <w:tcW w:type="dxa" w:w="4320"/>
-          </w:tcPr>
-          <w:p>
-            <w:r>
-              <w:t>Conditional</w:t>
-            </w:r>
-          </w:p>
-        </w:tc>
-      </w:tr>
-      <w:tr>
-        <w:tc>
-          <w:tcPr>
-            <w:tcW w:type="dxa" w:w="4320"/>
-          </w:tcPr>
-          <w:p>
-            <w:r>
-              <w:t>Ready for TestFlight?</w:t>
-            </w:r>
-          </w:p>
-        </w:tc>
-        <w:tc>
-          <w:tcPr>
-            <w:tcW w:type="dxa" w:w="4320"/>
-          </w:tcPr>
-          <w:p>
-            <w:r>
-              <w:t>After device depth + sync QA</w:t>
-            </w:r>
-          </w:p>
-        </w:tc>
-      </w:tr>
-      <w:tr>
-        <w:tc>
-          <w:tcPr>
-            <w:tcW w:type="dxa" w:w="4320"/>
-          </w:tcPr>
-          <w:p>
-            <w:r>
-              <w:t>Ready for App Store?</w:t>
-            </w:r>
-          </w:p>
-        </w:tc>
-        <w:tc>
-          <w:tcPr>
-            <w:tcW w:type="dxa" w:w="4320"/>
-          </w:tcPr>
-          <w:p>
-            <w:r>
-              <w:t>No</w:t>
-            </w:r>
-          </w:p>
-        </w:tc>
-      </w:tr>
-    </w:tbl>
-    <w:p>
-      <w:r>
-        <w:rPr>
-          <w:b w:val="0"/>
           <w:sz w:val="18"/>
         </w:rPr>
-        <w:t>Full markdown source: Docs/MAIN_BRANCH_COMPLETE_READINESS_AUDIT_20260520.md</w:t>
+        <w:t>Full markdown: MAIN_BRANCH_COMPLETE_READINESS_AUDIT_20260520.md</w:t>
       </w:r>
     </w:p>
     <w:sectPr>

</xml_diff>

<commit_message>
docs: sync documentation from main @ 86ef349
Align README, CHANGELOG, feature CSV, roadmap, branch alignment,
readiness audits, PR status, and reference assets with main branch
post bd129ca readiness and documentation pass.

Co-authored-by: Cursor <cursoragent@cursor.com>
</commit_message>
<xml_diff>
--- a/Docs/MAIN_BRANCH_COMPLETE_READINESS_AUDIT_20260520.docx
+++ b/Docs/MAIN_BRANCH_COMPLETE_READINESS_AUDIT_20260520.docx
@@ -8,7 +8,7 @@
         <w:jc w:val="center"/>
       </w:pPr>
       <w:r>
-        <w:t>DIR DIVING — MAIN BRANCH COMPLETE READINESS AUDIT</w:t>
+        <w:t>DIR DIVING — MAIN Branch Complete Readiness Audit</w:t>
       </w:r>
     </w:p>
     <w:p>
@@ -17,7 +17,7 @@
           <w:b/>
           <w:sz w:val="20"/>
         </w:rPr>
-        <w:t>Date: 2026-05-20 · Branch: main · HEAD: 9def114a33eb25e363b657cf46f22b4cff3778e6</w:t>
+        <w:t>Date: 2026-05-20 · Branch: main · HEAD: db72dce6b88aa45f9fa694ad33dde4d4aa8b2589 (working tree has uncommitted changes)</w:t>
       </w:r>
     </w:p>
     <w:p>
@@ -26,7 +26,7 @@
           <w:b w:val="0"/>
           <w:sz w:val="20"/>
         </w:rPr>
-        <w:t>Audit-only: no code changes. Scope: Apple Watch MAIN + iOS Companion MAIN on unified main. Experimental branches not inspected except target exclusion in project.yml.</w:t>
+        <w:t>Audit-only (no code changes). Scope: Apple Watch MAIN + iOS Companion MAIN. Benchmarks: Docs/ReferenceUI/Watch_LIVE_reference.png and iOS_Companion_reference.png.</w:t>
       </w:r>
     </w:p>
     <w:p>
@@ -34,7 +34,7 @@
         <w:pStyle w:val="Heading1"/>
       </w:pPr>
       <w:r>
-        <w:t>A. Branch Confirmed</w:t>
+        <w:t>A. Branch &amp; Build</w:t>
       </w:r>
     </w:p>
     <w:p>
@@ -42,7 +42,7 @@
         <w:pStyle w:val="ListBullet"/>
       </w:pPr>
       <w:r>
-        <w:t>Branch: main · HEAD: 9def114a33eb25e363b657cf46f22b4cff3778e6</w:t>
+        <w:t>Branch main @ db72dce6b88aa45f9fa694ad33dde4d4aa8b2589.</w:t>
       </w:r>
     </w:p>
     <w:p>
@@ -50,7 +50,7 @@
         <w:pStyle w:val="ListBullet"/>
       </w:pPr>
       <w:r>
-        <w:t>project.yml valid; xcodegen generate succeeded.</w:t>
+        <w:t>xcodegen + Watch + iOS builds: SUCCEEDED (audit run 2026-05-20).</w:t>
       </w:r>
     </w:p>
     <w:p>
@@ -58,7 +58,7 @@
         <w:pStyle w:val="ListBullet"/>
       </w:pPr>
       <w:r>
-        <w:t>Experimental sources excluded from MAIN targets (Apnea, Snorkeling, Buddy, Exploration).</w:t>
+        <w:t>project.yml excludes experimental sources from MAIN targets.</w:t>
       </w:r>
     </w:p>
     <w:p>
@@ -66,7 +66,7 @@
         <w:pStyle w:val="ListBullet"/>
       </w:pPr>
       <w:r>
-        <w:t>xcodebuild: DIRDiving Watch App + DIRDiving iOS — BUILD SUCCEEDED (simulator, 2026-05-20).</w:t>
+        <w:t>Bundle IDs: iOS com.egopfe.dirdiving.ios; Watch com.egopfe.dirdiving.ios.watch.</w:t>
       </w:r>
     </w:p>
     <w:p>
@@ -74,7 +74,23 @@
         <w:pStyle w:val="ListBullet"/>
       </w:pPr>
       <w:r>
-        <w:t>Bundle IDs: com.egopfe.dirdiving (Watch), com.egopfe.dirdiving.ios (iOS).</w:t>
+        <w:t>Entitlements: iCloud KVS + CloudKit; Watch adds water submersion.</w:t>
+      </w:r>
+    </w:p>
+    <w:p>
+      <w:pPr>
+        <w:pStyle w:val="ListBullet"/>
+      </w:pPr>
+      <w:r>
+        <w:t>1 non-blocking AppIntents metadata warning on iOS build.</w:t>
+      </w:r>
+    </w:p>
+    <w:p>
+      <w:pPr>
+        <w:pStyle w:val="ListBullet"/>
+      </w:pPr>
+      <w:r>
+        <w:t>Uncommitted WIP on disk: PlannerSafetyAcknowledgment, CloudSyncStore decode UI, iOS localization.</w:t>
       </w:r>
     </w:p>
     <w:p>
@@ -92,13 +108,14 @@
         <w:tblLook w:firstColumn="1" w:firstRow="1" w:lastColumn="0" w:lastRow="0" w:noHBand="0" w:noVBand="1" w:val="04A0"/>
       </w:tblPr>
       <w:tblGrid>
-        <w:gridCol w:w="4320"/>
-        <w:gridCol w:w="4320"/>
+        <w:gridCol w:w="2880"/>
+        <w:gridCol w:w="2880"/>
+        <w:gridCol w:w="2880"/>
       </w:tblGrid>
       <w:tr>
         <w:tc>
           <w:tcPr>
-            <w:tcW w:type="dxa" w:w="4320"/>
+            <w:tcW w:type="dxa" w:w="2880"/>
           </w:tcPr>
           <w:p>
             <w:r>
@@ -108,11 +125,21 @@
         </w:tc>
         <w:tc>
           <w:tcPr>
-            <w:tcW w:type="dxa" w:w="4320"/>
+            <w:tcW w:type="dxa" w:w="2880"/>
           </w:tcPr>
           <w:p>
             <w:r>
-              <w:t>Readiness %</w:t>
+              <w:t>db72dce (committed)</w:t>
+            </w:r>
+          </w:p>
+        </w:tc>
+        <w:tc>
+          <w:tcPr>
+            <w:tcW w:type="dxa" w:w="2880"/>
+          </w:tcPr>
+          <w:p>
+            <w:r>
+              <w:t>With local WIP</w:t>
             </w:r>
           </w:p>
         </w:tc>
@@ -120,21 +147,31 @@
       <w:tr>
         <w:tc>
           <w:tcPr>
-            <w:tcW w:type="dxa" w:w="4320"/>
+            <w:tcW w:type="dxa" w:w="2880"/>
           </w:tcPr>
           <w:p>
             <w:r>
-              <w:t>Overall MAIN</w:t>
+              <w:t>Overall</w:t>
             </w:r>
           </w:p>
         </w:tc>
         <w:tc>
           <w:tcPr>
-            <w:tcW w:type="dxa" w:w="4320"/>
+            <w:tcW w:type="dxa" w:w="2880"/>
           </w:tcPr>
           <w:p>
             <w:r>
-              <w:t>84%</w:t>
+              <w:t>~91%</w:t>
+            </w:r>
+          </w:p>
+        </w:tc>
+        <w:tc>
+          <w:tcPr>
+            <w:tcW w:type="dxa" w:w="2880"/>
+          </w:tcPr>
+          <w:p>
+            <w:r>
+              <w:t>~94%</w:t>
             </w:r>
           </w:p>
         </w:tc>
@@ -142,7 +179,39 @@
       <w:tr>
         <w:tc>
           <w:tcPr>
-            <w:tcW w:type="dxa" w:w="4320"/>
+            <w:tcW w:type="dxa" w:w="2880"/>
+          </w:tcPr>
+          <w:p>
+            <w:r>
+              <w:t>Compile</w:t>
+            </w:r>
+          </w:p>
+        </w:tc>
+        <w:tc>
+          <w:tcPr>
+            <w:tcW w:type="dxa" w:w="2880"/>
+          </w:tcPr>
+          <w:p>
+            <w:r>
+              <w:t>100%</w:t>
+            </w:r>
+          </w:p>
+        </w:tc>
+        <w:tc>
+          <w:tcPr>
+            <w:tcW w:type="dxa" w:w="2880"/>
+          </w:tcPr>
+          <w:p>
+            <w:r>
+              <w:t>100%</w:t>
+            </w:r>
+          </w:p>
+        </w:tc>
+      </w:tr>
+      <w:tr>
+        <w:tc>
+          <w:tcPr>
+            <w:tcW w:type="dxa" w:w="2880"/>
           </w:tcPr>
           <w:p>
             <w:r>
@@ -152,11 +221,21 @@
         </w:tc>
         <w:tc>
           <w:tcPr>
-            <w:tcW w:type="dxa" w:w="4320"/>
+            <w:tcW w:type="dxa" w:w="2880"/>
           </w:tcPr>
           <w:p>
             <w:r>
-              <w:t>88%</w:t>
+              <w:t>~93%</w:t>
+            </w:r>
+          </w:p>
+        </w:tc>
+        <w:tc>
+          <w:tcPr>
+            <w:tcW w:type="dxa" w:w="2880"/>
+          </w:tcPr>
+          <w:p>
+            <w:r>
+              <w:t>~93%</w:t>
             </w:r>
           </w:p>
         </w:tc>
@@ -164,7 +243,7 @@
       <w:tr>
         <w:tc>
           <w:tcPr>
-            <w:tcW w:type="dxa" w:w="4320"/>
+            <w:tcW w:type="dxa" w:w="2880"/>
           </w:tcPr>
           <w:p>
             <w:r>
@@ -174,11 +253,21 @@
         </w:tc>
         <w:tc>
           <w:tcPr>
-            <w:tcW w:type="dxa" w:w="4320"/>
+            <w:tcW w:type="dxa" w:w="2880"/>
           </w:tcPr>
           <w:p>
             <w:r>
-              <w:t>86%</w:t>
+              <w:t>~90%</w:t>
+            </w:r>
+          </w:p>
+        </w:tc>
+        <w:tc>
+          <w:tcPr>
+            <w:tcW w:type="dxa" w:w="2880"/>
+          </w:tcPr>
+          <w:p>
+            <w:r>
+              <w:t>~93%</w:t>
             </w:r>
           </w:p>
         </w:tc>
@@ -186,7 +275,7 @@
       <w:tr>
         <w:tc>
           <w:tcPr>
-            <w:tcW w:type="dxa" w:w="4320"/>
+            <w:tcW w:type="dxa" w:w="2880"/>
           </w:tcPr>
           <w:p>
             <w:r>
@@ -196,11 +285,21 @@
         </w:tc>
         <w:tc>
           <w:tcPr>
-            <w:tcW w:type="dxa" w:w="4320"/>
+            <w:tcW w:type="dxa" w:w="2880"/>
           </w:tcPr>
           <w:p>
             <w:r>
-              <w:t>80%</w:t>
+              <w:t>~93%</w:t>
+            </w:r>
+          </w:p>
+        </w:tc>
+        <w:tc>
+          <w:tcPr>
+            <w:tcW w:type="dxa" w:w="2880"/>
+          </w:tcPr>
+          <w:p>
+            <w:r>
+              <w:t>~95%</w:t>
             </w:r>
           </w:p>
         </w:tc>
@@ -208,21 +307,31 @@
       <w:tr>
         <w:tc>
           <w:tcPr>
-            <w:tcW w:type="dxa" w:w="4320"/>
+            <w:tcW w:type="dxa" w:w="2880"/>
           </w:tcPr>
           <w:p>
             <w:r>
-              <w:t>Safety / disclaimers</w:t>
+              <w:t>Safety</w:t>
             </w:r>
           </w:p>
         </w:tc>
         <w:tc>
           <w:tcPr>
-            <w:tcW w:type="dxa" w:w="4320"/>
+            <w:tcW w:type="dxa" w:w="2880"/>
           </w:tcPr>
           <w:p>
             <w:r>
-              <w:t>82%</w:t>
+              <w:t>~88%</w:t>
+            </w:r>
+          </w:p>
+        </w:tc>
+        <w:tc>
+          <w:tcPr>
+            <w:tcW w:type="dxa" w:w="2880"/>
+          </w:tcPr>
+          <w:p>
+            <w:r>
+              <w:t>~88%</w:t>
             </w:r>
           </w:p>
         </w:tc>
@@ -230,41 +339,1481 @@
       <w:tr>
         <w:tc>
           <w:tcPr>
-            <w:tcW w:type="dxa" w:w="4320"/>
+            <w:tcW w:type="dxa" w:w="2880"/>
           </w:tcPr>
           <w:p>
             <w:r>
-              <w:t>Compile readiness</w:t>
+              <w:t>UI vs reference</w:t>
             </w:r>
           </w:p>
         </w:tc>
         <w:tc>
           <w:tcPr>
-            <w:tcW w:type="dxa" w:w="4320"/>
+            <w:tcW w:type="dxa" w:w="2880"/>
           </w:tcPr>
           <w:p>
             <w:r>
-              <w:t>92%</w:t>
+              <w:t>~88%</w:t>
+            </w:r>
+          </w:p>
+        </w:tc>
+        <w:tc>
+          <w:tcPr>
+            <w:tcW w:type="dxa" w:w="2880"/>
+          </w:tcPr>
+          <w:p>
+            <w:r>
+              <w:t>~90%</w:t>
             </w:r>
           </w:p>
         </w:tc>
       </w:tr>
     </w:tbl>
     <w:p>
+      <w:pPr>
+        <w:pStyle w:val="Heading1"/>
+      </w:pPr>
       <w:r>
-        <w:rPr>
-          <w:b w:val="0"/>
-          <w:sz w:val="20"/>
-        </w:rPr>
-        <w:t>Verdict: ready for internal/simulator testing and developer-led device QA. Not 100% for average consumer or App Store until real Ultra depth validation, physical sync QA, and release legal/asset review.</w:t>
+        <w:t>C. Feature Inventory (highlights)</w:t>
+      </w:r>
+    </w:p>
+    <w:tbl>
+      <w:tblPr>
+        <w:tblStyle w:val="TableGrid"/>
+        <w:tblW w:type="auto" w:w="0"/>
+        <w:tblLook w:firstColumn="1" w:firstRow="1" w:lastColumn="0" w:lastRow="0" w:noHBand="0" w:noVBand="1" w:val="04A0"/>
+      </w:tblPr>
+      <w:tblGrid>
+        <w:gridCol w:w="2160"/>
+        <w:gridCol w:w="2160"/>
+        <w:gridCol w:w="2160"/>
+        <w:gridCol w:w="2160"/>
+      </w:tblGrid>
+      <w:tr>
+        <w:tc>
+          <w:tcPr>
+            <w:tcW w:type="dxa" w:w="2160"/>
+          </w:tcPr>
+          <w:p>
+            <w:r>
+              <w:t>Platform</w:t>
+            </w:r>
+          </w:p>
+        </w:tc>
+        <w:tc>
+          <w:tcPr>
+            <w:tcW w:type="dxa" w:w="2160"/>
+          </w:tcPr>
+          <w:p>
+            <w:r>
+              <w:t>Feature</w:t>
+            </w:r>
+          </w:p>
+        </w:tc>
+        <w:tc>
+          <w:tcPr>
+            <w:tcW w:type="dxa" w:w="2160"/>
+          </w:tcPr>
+          <w:p>
+            <w:r>
+              <w:t>Complete</w:t>
+            </w:r>
+          </w:p>
+        </w:tc>
+        <w:tc>
+          <w:tcPr>
+            <w:tcW w:type="dxa" w:w="2160"/>
+          </w:tcPr>
+          <w:p>
+            <w:r>
+              <w:t>Notes</w:t>
+            </w:r>
+          </w:p>
+        </w:tc>
+      </w:tr>
+      <w:tr>
+        <w:tc>
+          <w:tcPr>
+            <w:tcW w:type="dxa" w:w="2160"/>
+          </w:tcPr>
+          <w:p>
+            <w:r>
+              <w:t>Watch</w:t>
+            </w:r>
+          </w:p>
+        </w:tc>
+        <w:tc>
+          <w:tcPr>
+            <w:tcW w:type="dxa" w:w="2160"/>
+          </w:tcPr>
+          <w:p>
+            <w:r>
+              <w:t>Live dive + ascent gauge</w:t>
+            </w:r>
+          </w:p>
+        </w:tc>
+        <w:tc>
+          <w:tcPr>
+            <w:tcW w:type="dxa" w:w="2160"/>
+          </w:tcPr>
+          <w:p>
+            <w:r>
+              <w:t>Y</w:t>
+            </w:r>
+          </w:p>
+        </w:tc>
+        <w:tc>
+          <w:tcPr>
+            <w:tcW w:type="dxa" w:w="2160"/>
+          </w:tcPr>
+          <w:p>
+            <w:r>
+              <w:t>Matches neon reference</w:t>
+            </w:r>
+          </w:p>
+        </w:tc>
+      </w:tr>
+      <w:tr>
+        <w:tc>
+          <w:tcPr>
+            <w:tcW w:type="dxa" w:w="2160"/>
+          </w:tcPr>
+          <w:p>
+            <w:r>
+              <w:t>Watch</w:t>
+            </w:r>
+          </w:p>
+        </w:tc>
+        <w:tc>
+          <w:tcPr>
+            <w:tcW w:type="dxa" w:w="2160"/>
+          </w:tcPr>
+          <w:p>
+            <w:r>
+              <w:t>Auto depth / submersion</w:t>
+            </w:r>
+          </w:p>
+        </w:tc>
+        <w:tc>
+          <w:tcPr>
+            <w:tcW w:type="dxa" w:w="2160"/>
+          </w:tcPr>
+          <w:p>
+            <w:r>
+              <w:t>P</w:t>
+            </w:r>
+          </w:p>
+        </w:tc>
+        <w:tc>
+          <w:tcPr>
+            <w:tcW w:type="dxa" w:w="2160"/>
+          </w:tcPr>
+          <w:p>
+            <w:r>
+              <w:t>Ultra + entitlement required</w:t>
+            </w:r>
+          </w:p>
+        </w:tc>
+      </w:tr>
+      <w:tr>
+        <w:tc>
+          <w:tcPr>
+            <w:tcW w:type="dxa" w:w="2160"/>
+          </w:tcPr>
+          <w:p>
+            <w:r>
+              <w:t>Watch</w:t>
+            </w:r>
+          </w:p>
+        </w:tc>
+        <w:tc>
+          <w:tcPr>
+            <w:tcW w:type="dxa" w:w="2160"/>
+          </w:tcPr>
+          <w:p>
+            <w:r>
+              <w:t>7 App Shortcuts</w:t>
+            </w:r>
+          </w:p>
+        </w:tc>
+        <w:tc>
+          <w:tcPr>
+            <w:tcW w:type="dxa" w:w="2160"/>
+          </w:tcPr>
+          <w:p>
+            <w:r>
+              <w:t>Y</w:t>
+            </w:r>
+          </w:p>
+        </w:tc>
+        <w:tc>
+          <w:tcPr>
+            <w:tcW w:type="dxa" w:w="2160"/>
+          </w:tcPr>
+          <w:p>
+            <w:r>
+              <w:t>Side button via Shortcuts only</w:t>
+            </w:r>
+          </w:p>
+        </w:tc>
+      </w:tr>
+      <w:tr>
+        <w:tc>
+          <w:tcPr>
+            <w:tcW w:type="dxa" w:w="2160"/>
+          </w:tcPr>
+          <w:p>
+            <w:r>
+              <w:t>Watch</w:t>
+            </w:r>
+          </w:p>
+        </w:tc>
+        <w:tc>
+          <w:tcPr>
+            <w:tcW w:type="dxa" w:w="2160"/>
+          </w:tcPr>
+          <w:p>
+            <w:r>
+              <w:t>Audio tones</w:t>
+            </w:r>
+          </w:p>
+        </w:tc>
+        <w:tc>
+          <w:tcPr>
+            <w:tcW w:type="dxa" w:w="2160"/>
+          </w:tcPr>
+          <w:p>
+            <w:r>
+              <w:t>N</w:t>
+            </w:r>
+          </w:p>
+        </w:tc>
+        <w:tc>
+          <w:tcPr>
+            <w:tcW w:type="dxa" w:w="2160"/>
+          </w:tcPr>
+          <w:p>
+            <w:r>
+              <w:t>Informational settings row</w:t>
+            </w:r>
+          </w:p>
+        </w:tc>
+      </w:tr>
+      <w:tr>
+        <w:tc>
+          <w:tcPr>
+            <w:tcW w:type="dxa" w:w="2160"/>
+          </w:tcPr>
+          <w:p>
+            <w:r>
+              <w:t>iOS</w:t>
+            </w:r>
+          </w:p>
+        </w:tc>
+        <w:tc>
+          <w:tcPr>
+            <w:tcW w:type="dxa" w:w="2160"/>
+          </w:tcPr>
+          <w:p>
+            <w:r>
+              <w:t>Logbook + detail + CSV</w:t>
+            </w:r>
+          </w:p>
+        </w:tc>
+        <w:tc>
+          <w:tcPr>
+            <w:tcW w:type="dxa" w:w="2160"/>
+          </w:tcPr>
+          <w:p>
+            <w:r>
+              <w:t>Y</w:t>
+            </w:r>
+          </w:p>
+        </w:tc>
+        <w:tc>
+          <w:tcPr>
+            <w:tcW w:type="dxa" w:w="2160"/>
+          </w:tcPr>
+          <w:p>
+            <w:r>
+              <w:t>No list thumbnails vs mock</w:t>
+            </w:r>
+          </w:p>
+        </w:tc>
+      </w:tr>
+      <w:tr>
+        <w:tc>
+          <w:tcPr>
+            <w:tcW w:type="dxa" w:w="2160"/>
+          </w:tcPr>
+          <w:p>
+            <w:r>
+              <w:t>iOS</w:t>
+            </w:r>
+          </w:p>
+        </w:tc>
+        <w:tc>
+          <w:tcPr>
+            <w:tcW w:type="dxa" w:w="2160"/>
+          </w:tcPr>
+          <w:p>
+            <w:r>
+              <w:t>Planner + Bühlmann</w:t>
+            </w:r>
+          </w:p>
+        </w:tc>
+        <w:tc>
+          <w:tcPr>
+            <w:tcW w:type="dxa" w:w="2160"/>
+          </w:tcPr>
+          <w:p>
+            <w:r>
+              <w:t>P</w:t>
+            </w:r>
+          </w:p>
+        </w:tc>
+        <w:tc>
+          <w:tcPr>
+            <w:tcW w:type="dxa" w:w="2160"/>
+          </w:tcPr>
+          <w:p>
+            <w:r>
+              <w:t>Indicative; not certified DC</w:t>
+            </w:r>
+          </w:p>
+        </w:tc>
+      </w:tr>
+      <w:tr>
+        <w:tc>
+          <w:tcPr>
+            <w:tcW w:type="dxa" w:w="2160"/>
+          </w:tcPr>
+          <w:p>
+            <w:r>
+              <w:t>iOS</w:t>
+            </w:r>
+          </w:p>
+        </w:tc>
+        <w:tc>
+          <w:tcPr>
+            <w:tcW w:type="dxa" w:w="2160"/>
+          </w:tcPr>
+          <w:p>
+            <w:r>
+              <w:t>Watch sync + conflicts</w:t>
+            </w:r>
+          </w:p>
+        </w:tc>
+        <w:tc>
+          <w:tcPr>
+            <w:tcW w:type="dxa" w:w="2160"/>
+          </w:tcPr>
+          <w:p>
+            <w:r>
+              <w:t>Y</w:t>
+            </w:r>
+          </w:p>
+        </w:tc>
+        <w:tc>
+          <w:tcPr>
+            <w:tcW w:type="dxa" w:w="2160"/>
+          </w:tcPr>
+          <w:p>
+            <w:r>
+              <w:t>More UI for conflicts</w:t>
+            </w:r>
+          </w:p>
+        </w:tc>
+      </w:tr>
+      <w:tr>
+        <w:tc>
+          <w:tcPr>
+            <w:tcW w:type="dxa" w:w="2160"/>
+          </w:tcPr>
+          <w:p>
+            <w:r>
+              <w:t>iOS</w:t>
+            </w:r>
+          </w:p>
+        </w:tc>
+        <w:tc>
+          <w:tcPr>
+            <w:tcW w:type="dxa" w:w="2160"/>
+          </w:tcPr>
+          <w:p>
+            <w:r>
+              <w:t>iCloud KVS</w:t>
+            </w:r>
+          </w:p>
+        </w:tc>
+        <w:tc>
+          <w:tcPr>
+            <w:tcW w:type="dxa" w:w="2160"/>
+          </w:tcPr>
+          <w:p>
+            <w:r>
+              <w:t>P</w:t>
+            </w:r>
+          </w:p>
+        </w:tc>
+        <w:tc>
+          <w:tcPr>
+            <w:tcW w:type="dxa" w:w="2160"/>
+          </w:tcPr>
+          <w:p>
+            <w:r>
+              <w:t>Decode error silent until WIP committed</w:t>
+            </w:r>
+          </w:p>
+        </w:tc>
+      </w:tr>
+      <w:tr>
+        <w:tc>
+          <w:tcPr>
+            <w:tcW w:type="dxa" w:w="2160"/>
+          </w:tcPr>
+          <w:p>
+            <w:r>
+              <w:t>iOS</w:t>
+            </w:r>
+          </w:p>
+        </w:tc>
+        <w:tc>
+          <w:tcPr>
+            <w:tcW w:type="dxa" w:w="2160"/>
+          </w:tcPr>
+          <w:p>
+            <w:r>
+              <w:t>GPX/KML/.ssrf</w:t>
+            </w:r>
+          </w:p>
+        </w:tc>
+        <w:tc>
+          <w:tcPr>
+            <w:tcW w:type="dxa" w:w="2160"/>
+          </w:tcPr>
+          <w:p>
+            <w:r>
+              <w:t>N</w:t>
+            </w:r>
+          </w:p>
+        </w:tc>
+        <w:tc>
+          <w:tcPr>
+            <w:tcW w:type="dxa" w:w="2160"/>
+          </w:tcPr>
+          <w:p>
+            <w:r>
+              <w:t>CSV only in MAIN</w:t>
+            </w:r>
+          </w:p>
+        </w:tc>
+      </w:tr>
+    </w:tbl>
+    <w:p>
+      <w:pPr>
+        <w:pStyle w:val="Heading1"/>
+      </w:pPr>
+      <w:r>
+        <w:t>D. Navigation</w:t>
       </w:r>
     </w:p>
     <w:p>
       <w:pPr>
-        <w:pStyle w:val="Heading2"/>
+        <w:pStyle w:val="ListBullet"/>
       </w:pPr>
       <w:r>
-        <w:t>Visual benchmarks</w:t>
+        <w:t>Watch: Live → BUSSOLA → Settings → [Images] → Dive Log → Detail.</w:t>
+      </w:r>
+    </w:p>
+    <w:p>
+      <w:pPr>
+        <w:pStyle w:val="ListBullet"/>
+      </w:pPr>
+      <w:r>
+        <w:t>iOS: Planner → Logbook → Analysis → Equipment → More (reference mock: Logbook first).</w:t>
+      </w:r>
+    </w:p>
+    <w:p>
+      <w:pPr>
+        <w:pStyle w:val="ListBullet"/>
+      </w:pPr>
+      <w:r>
+        <w:t>No critical dead ends; legal gates intentional.</w:t>
+      </w:r>
+    </w:p>
+    <w:p>
+      <w:pPr>
+        <w:pStyle w:val="Heading1"/>
+      </w:pPr>
+      <w:r>
+        <w:t>E. UI Consistency vs Reference</w:t>
+      </w:r>
+    </w:p>
+    <w:tbl>
+      <w:tblPr>
+        <w:tblStyle w:val="TableGrid"/>
+        <w:tblW w:type="auto" w:w="0"/>
+        <w:tblLook w:firstColumn="1" w:firstRow="1" w:lastColumn="0" w:lastRow="0" w:noHBand="0" w:noVBand="1" w:val="04A0"/>
+      </w:tblPr>
+      <w:tblGrid>
+        <w:gridCol w:w="2160"/>
+        <w:gridCol w:w="2160"/>
+        <w:gridCol w:w="2160"/>
+        <w:gridCol w:w="2160"/>
+      </w:tblGrid>
+      <w:tr>
+        <w:tc>
+          <w:tcPr>
+            <w:tcW w:type="dxa" w:w="2160"/>
+          </w:tcPr>
+          <w:p>
+            <w:r>
+              <w:t>Platform</w:t>
+            </w:r>
+          </w:p>
+        </w:tc>
+        <w:tc>
+          <w:tcPr>
+            <w:tcW w:type="dxa" w:w="2160"/>
+          </w:tcPr>
+          <w:p>
+            <w:r>
+              <w:t>Match</w:t>
+            </w:r>
+          </w:p>
+        </w:tc>
+        <w:tc>
+          <w:tcPr>
+            <w:tcW w:type="dxa" w:w="2160"/>
+          </w:tcPr>
+          <w:p>
+            <w:r>
+              <w:t>Gap</w:t>
+            </w:r>
+          </w:p>
+        </w:tc>
+        <w:tc>
+          <w:tcPr>
+            <w:tcW w:type="dxa" w:w="2160"/>
+          </w:tcPr>
+          <w:p>
+            <w:r>
+              <w:t>Severity</w:t>
+            </w:r>
+          </w:p>
+        </w:tc>
+      </w:tr>
+      <w:tr>
+        <w:tc>
+          <w:tcPr>
+            <w:tcW w:type="dxa" w:w="2160"/>
+          </w:tcPr>
+          <w:p>
+            <w:r>
+              <w:t>Watch</w:t>
+            </w:r>
+          </w:p>
+        </w:tc>
+        <w:tc>
+          <w:tcPr>
+            <w:tcW w:type="dxa" w:w="2160"/>
+          </w:tcPr>
+          <w:p>
+            <w:r>
+              <w:t>Strong</w:t>
+            </w:r>
+          </w:p>
+        </w:tc>
+        <w:tc>
+          <w:tcPr>
+            <w:tcW w:type="dxa" w:w="2160"/>
+          </w:tcPr>
+          <w:p>
+            <w:r>
+              <w:t>Some EN labels (RunTime)</w:t>
+            </w:r>
+          </w:p>
+        </w:tc>
+        <w:tc>
+          <w:tcPr>
+            <w:tcW w:type="dxa" w:w="2160"/>
+          </w:tcPr>
+          <w:p>
+            <w:r>
+              <w:t>LOW</w:t>
+            </w:r>
+          </w:p>
+        </w:tc>
+      </w:tr>
+      <w:tr>
+        <w:tc>
+          <w:tcPr>
+            <w:tcW w:type="dxa" w:w="2160"/>
+          </w:tcPr>
+          <w:p>
+            <w:r>
+              <w:t>iOS</w:t>
+            </w:r>
+          </w:p>
+        </w:tc>
+        <w:tc>
+          <w:tcPr>
+            <w:tcW w:type="dxa" w:w="2160"/>
+          </w:tcPr>
+          <w:p>
+            <w:r>
+              <w:t>Strong theme</w:t>
+            </w:r>
+          </w:p>
+        </w:tc>
+        <w:tc>
+          <w:tcPr>
+            <w:tcW w:type="dxa" w:w="2160"/>
+          </w:tcPr>
+          <w:p>
+            <w:r>
+              <w:t>Tab order; no logbook photos</w:t>
+            </w:r>
+          </w:p>
+        </w:tc>
+        <w:tc>
+          <w:tcPr>
+            <w:tcW w:type="dxa" w:w="2160"/>
+          </w:tcPr>
+          <w:p>
+            <w:r>
+              <w:t>LOW</w:t>
+            </w:r>
+          </w:p>
+        </w:tc>
+      </w:tr>
+      <w:tr>
+        <w:tc>
+          <w:tcPr>
+            <w:tcW w:type="dxa" w:w="2160"/>
+          </w:tcPr>
+          <w:p>
+            <w:r>
+              <w:t>iOS</w:t>
+            </w:r>
+          </w:p>
+        </w:tc>
+        <w:tc>
+          <w:tcPr>
+            <w:tcW w:type="dxa" w:w="2160"/>
+          </w:tcPr>
+          <w:p>
+            <w:r>
+              <w:t>Cards/charts</w:t>
+            </w:r>
+          </w:p>
+        </w:tc>
+        <w:tc>
+          <w:tcPr>
+            <w:tcW w:type="dxa" w:w="2160"/>
+          </w:tcPr>
+          <w:p>
+            <w:r>
+              <w:t>Planner/Equipment IT literals</w:t>
+            </w:r>
+          </w:p>
+        </w:tc>
+        <w:tc>
+          <w:tcPr>
+            <w:tcW w:type="dxa" w:w="2160"/>
+          </w:tcPr>
+          <w:p>
+            <w:r>
+              <w:t>LOW</w:t>
+            </w:r>
+          </w:p>
+        </w:tc>
+      </w:tr>
+      <w:tr>
+        <w:tc>
+          <w:tcPr>
+            <w:tcW w:type="dxa" w:w="2160"/>
+          </w:tcPr>
+          <w:p>
+            <w:r>
+              <w:t>Marketing</w:t>
+            </w:r>
+          </w:p>
+        </w:tc>
+        <w:tc>
+          <w:tcPr>
+            <w:tcW w:type="dxa" w:w="2160"/>
+          </w:tcPr>
+          <w:p>
+            <w:r>
+              <w:t>—</w:t>
+            </w:r>
+          </w:p>
+        </w:tc>
+        <w:tc>
+          <w:tcPr>
+            <w:tcW w:type="dxa" w:w="2160"/>
+          </w:tcPr>
+          <w:p>
+            <w:r>
+              <w:t>.ssrf in mock; app ships CSV</w:t>
+            </w:r>
+          </w:p>
+        </w:tc>
+        <w:tc>
+          <w:tcPr>
+            <w:tcW w:type="dxa" w:w="2160"/>
+          </w:tcPr>
+          <w:p>
+            <w:r>
+              <w:t>LOW</w:t>
+            </w:r>
+          </w:p>
+        </w:tc>
+      </w:tr>
+    </w:tbl>
+    <w:p>
+      <w:pPr>
+        <w:pStyle w:val="Heading1"/>
+      </w:pPr>
+      <w:r>
+        <w:t>F–H. Settings / Haptics / Hardware</w:t>
+      </w:r>
+    </w:p>
+    <w:p>
+      <w:pPr>
+        <w:pStyle w:val="ListBullet"/>
+      </w:pPr>
+      <w:r>
+        <w:t>Watch: units, alarms, ascent, haptics persisted and applied; tones N/A.</w:t>
+      </w:r>
+    </w:p>
+    <w:p>
+      <w:pPr>
+        <w:pStyle w:val="ListBullet"/>
+      </w:pPr>
+      <w:r>
+        <w:t>iOS: units + demo + cloud + WC sync; planner ack session-only @ db72dce (WIP fixes).</w:t>
+      </w:r>
+    </w:p>
+    <w:p>
+      <w:pPr>
+        <w:pStyle w:val="ListBullet"/>
+      </w:pPr>
+      <w:r>
+        <w:t>Haptics: comprehensive on Watch; iOS text-only feedback.</w:t>
+      </w:r>
+    </w:p>
+    <w:p>
+      <w:pPr>
+        <w:pStyle w:val="ListBullet"/>
+      </w:pPr>
+      <w:r>
+        <w:t>Crown: vertical paging; side button not mapped; Action Button via App Intents.</w:t>
+      </w:r>
+    </w:p>
+    <w:p>
+      <w:pPr>
+        <w:pStyle w:val="Heading1"/>
+      </w:pPr>
+      <w:r>
+        <w:t>I–J. Sync &amp; Export</w:t>
+      </w:r>
+    </w:p>
+    <w:p>
+      <w:pPr>
+        <w:pStyle w:val="ListBullet"/>
+      </w:pPr>
+      <w:r>
+        <w:t>Watch ↔ iPhone: signed dive payloads, tombstones, units, photos, offline queue.</w:t>
+      </w:r>
+    </w:p>
+    <w:p>
+      <w:pPr>
+        <w:pStyle w:val="ListBullet"/>
+      </w:pPr>
+      <w:r>
+        <w:t>iCloud: KVS merge; decode failures need WIP UI before App Store.</w:t>
+      </w:r>
+    </w:p>
+    <w:p>
+      <w:pPr>
+        <w:pStyle w:val="ListBullet"/>
+      </w:pPr>
+      <w:r>
+        <w:t>Export: Subsurface CSV both platforms; ShareLink; GPX/KML not in MAIN.</w:t>
+      </w:r>
+    </w:p>
+    <w:p>
+      <w:pPr>
+        <w:pStyle w:val="Heading1"/>
+      </w:pPr>
+      <w:r>
+        <w:t>K–L. Safety &amp; Empty States</w:t>
+      </w:r>
+    </w:p>
+    <w:p>
+      <w:pPr>
+        <w:pStyle w:val="ListBullet"/>
+      </w:pPr>
+      <w:r>
+        <w:t>Strong disclaimers; planner not certified decompression guidance.</w:t>
+      </w:r>
+    </w:p>
+    <w:p>
+      <w:pPr>
+        <w:pStyle w:val="ListBullet"/>
+      </w:pPr>
+      <w:r>
+        <w:t>Depth 35/38/40 m fixed; ascent banner inline.</w:t>
+      </w:r>
+    </w:p>
+    <w:p>
+      <w:pPr>
+        <w:pStyle w:val="ListBullet"/>
+      </w:pPr>
+      <w:r>
+        <w:t>Empty states on logbook/analysis; sync/export errors mostly visible.</w:t>
+      </w:r>
+    </w:p>
+    <w:p>
+      <w:pPr>
+        <w:pStyle w:val="ListBullet"/>
+      </w:pPr>
+      <w:r>
+        <w:t>Blocker: physical Ultra depth QA (R1).</w:t>
+      </w:r>
+    </w:p>
+    <w:p>
+      <w:pPr>
+        <w:pStyle w:val="Heading1"/>
+      </w:pPr>
+      <w:r>
+        <w:t>M. Bugs To Fix</w:t>
+      </w:r>
+    </w:p>
+    <w:tbl>
+      <w:tblPr>
+        <w:tblStyle w:val="TableGrid"/>
+        <w:tblW w:type="auto" w:w="0"/>
+        <w:tblLook w:firstColumn="1" w:firstRow="1" w:lastColumn="0" w:lastRow="0" w:noHBand="0" w:noVBand="1" w:val="04A0"/>
+      </w:tblPr>
+      <w:tblGrid>
+        <w:gridCol w:w="2160"/>
+        <w:gridCol w:w="2160"/>
+        <w:gridCol w:w="2160"/>
+        <w:gridCol w:w="2160"/>
+      </w:tblGrid>
+      <w:tr>
+        <w:tc>
+          <w:tcPr>
+            <w:tcW w:type="dxa" w:w="2160"/>
+          </w:tcPr>
+          <w:p>
+            <w:r>
+              <w:t>ID</w:t>
+            </w:r>
+          </w:p>
+        </w:tc>
+        <w:tc>
+          <w:tcPr>
+            <w:tcW w:type="dxa" w:w="2160"/>
+          </w:tcPr>
+          <w:p>
+            <w:r>
+              <w:t>Severity</w:t>
+            </w:r>
+          </w:p>
+        </w:tc>
+        <w:tc>
+          <w:tcPr>
+            <w:tcW w:type="dxa" w:w="2160"/>
+          </w:tcPr>
+          <w:p>
+            <w:r>
+              <w:t>Issue</w:t>
+            </w:r>
+          </w:p>
+        </w:tc>
+        <w:tc>
+          <w:tcPr>
+            <w:tcW w:type="dxa" w:w="2160"/>
+          </w:tcPr>
+          <w:p>
+            <w:r>
+              <w:t>Status</w:t>
+            </w:r>
+          </w:p>
+        </w:tc>
+      </w:tr>
+      <w:tr>
+        <w:tc>
+          <w:tcPr>
+            <w:tcW w:type="dxa" w:w="2160"/>
+          </w:tcPr>
+          <w:p>
+            <w:r>
+              <w:t>R1</w:t>
+            </w:r>
+          </w:p>
+        </w:tc>
+        <w:tc>
+          <w:tcPr>
+            <w:tcW w:type="dxa" w:w="2160"/>
+          </w:tcPr>
+          <w:p>
+            <w:r>
+              <w:t>HIGH</w:t>
+            </w:r>
+          </w:p>
+        </w:tc>
+        <w:tc>
+          <w:tcPr>
+            <w:tcW w:type="dxa" w:w="2160"/>
+          </w:tcPr>
+          <w:p>
+            <w:r>
+              <w:t>Physical depth/submersion QA on Ultra</w:t>
+            </w:r>
+          </w:p>
+        </w:tc>
+        <w:tc>
+          <w:tcPr>
+            <w:tcW w:type="dxa" w:w="2160"/>
+          </w:tcPr>
+          <w:p>
+            <w:r>
+              <w:t>Open</w:t>
+            </w:r>
+          </w:p>
+        </w:tc>
+      </w:tr>
+      <w:tr>
+        <w:tc>
+          <w:tcPr>
+            <w:tcW w:type="dxa" w:w="2160"/>
+          </w:tcPr>
+          <w:p>
+            <w:r>
+              <w:t>R2</w:t>
+            </w:r>
+          </w:p>
+        </w:tc>
+        <w:tc>
+          <w:tcPr>
+            <w:tcW w:type="dxa" w:w="2160"/>
+          </w:tcPr>
+          <w:p>
+            <w:r>
+              <w:t>MED</w:t>
+            </w:r>
+          </w:p>
+        </w:tc>
+        <w:tc>
+          <w:tcPr>
+            <w:tcW w:type="dxa" w:w="2160"/>
+          </w:tcPr>
+          <w:p>
+            <w:r>
+              <w:t>Planner safety ack not persisted</w:t>
+            </w:r>
+          </w:p>
+        </w:tc>
+        <w:tc>
+          <w:tcPr>
+            <w:tcW w:type="dxa" w:w="2160"/>
+          </w:tcPr>
+          <w:p>
+            <w:r>
+              <w:t>WIP on disk</w:t>
+            </w:r>
+          </w:p>
+        </w:tc>
+      </w:tr>
+      <w:tr>
+        <w:tc>
+          <w:tcPr>
+            <w:tcW w:type="dxa" w:w="2160"/>
+          </w:tcPr>
+          <w:p>
+            <w:r>
+              <w:t>R3</w:t>
+            </w:r>
+          </w:p>
+        </w:tc>
+        <w:tc>
+          <w:tcPr>
+            <w:tcW w:type="dxa" w:w="2160"/>
+          </w:tcPr>
+          <w:p>
+            <w:r>
+              <w:t>MED</w:t>
+            </w:r>
+          </w:p>
+        </w:tc>
+        <w:tc>
+          <w:tcPr>
+            <w:tcW w:type="dxa" w:w="2160"/>
+          </w:tcPr>
+          <w:p>
+            <w:r>
+              <w:t>iCloud decode errors silent</w:t>
+            </w:r>
+          </w:p>
+        </w:tc>
+        <w:tc>
+          <w:tcPr>
+            <w:tcW w:type="dxa" w:w="2160"/>
+          </w:tcPr>
+          <w:p>
+            <w:r>
+              <w:t>WIP on disk</w:t>
+            </w:r>
+          </w:p>
+        </w:tc>
+      </w:tr>
+      <w:tr>
+        <w:tc>
+          <w:tcPr>
+            <w:tcW w:type="dxa" w:w="2160"/>
+          </w:tcPr>
+          <w:p>
+            <w:r>
+              <w:t>R4</w:t>
+            </w:r>
+          </w:p>
+        </w:tc>
+        <w:tc>
+          <w:tcPr>
+            <w:tcW w:type="dxa" w:w="2160"/>
+          </w:tcPr>
+          <w:p>
+            <w:r>
+              <w:t>LOW</w:t>
+            </w:r>
+          </w:p>
+        </w:tc>
+        <w:tc>
+          <w:tcPr>
+            <w:tcW w:type="dxa" w:w="2160"/>
+          </w:tcPr>
+          <w:p>
+            <w:r>
+              <w:t>Mixed IT/EN on iOS main screens</w:t>
+            </w:r>
+          </w:p>
+        </w:tc>
+        <w:tc>
+          <w:tcPr>
+            <w:tcW w:type="dxa" w:w="2160"/>
+          </w:tcPr>
+          <w:p>
+            <w:r>
+              <w:t>WIP partial</w:t>
+            </w:r>
+          </w:p>
+        </w:tc>
+      </w:tr>
+      <w:tr>
+        <w:tc>
+          <w:tcPr>
+            <w:tcW w:type="dxa" w:w="2160"/>
+          </w:tcPr>
+          <w:p>
+            <w:r>
+              <w:t>R5</w:t>
+            </w:r>
+          </w:p>
+        </w:tc>
+        <w:tc>
+          <w:tcPr>
+            <w:tcW w:type="dxa" w:w="2160"/>
+          </w:tcPr>
+          <w:p>
+            <w:r>
+              <w:t>LOW</w:t>
+            </w:r>
+          </w:p>
+        </w:tc>
+        <w:tc>
+          <w:tcPr>
+            <w:tcW w:type="dxa" w:w="2160"/>
+          </w:tcPr>
+          <w:p>
+            <w:r>
+              <w:t>Tab order vs reference mock</w:t>
+            </w:r>
+          </w:p>
+        </w:tc>
+        <w:tc>
+          <w:tcPr>
+            <w:tcW w:type="dxa" w:w="2160"/>
+          </w:tcPr>
+          <w:p>
+            <w:r>
+              <w:t>Open</w:t>
+            </w:r>
+          </w:p>
+        </w:tc>
+      </w:tr>
+      <w:tr>
+        <w:tc>
+          <w:tcPr>
+            <w:tcW w:type="dxa" w:w="2160"/>
+          </w:tcPr>
+          <w:p>
+            <w:r>
+              <w:t>R6</w:t>
+            </w:r>
+          </w:p>
+        </w:tc>
+        <w:tc>
+          <w:tcPr>
+            <w:tcW w:type="dxa" w:w="2160"/>
+          </w:tcPr>
+          <w:p>
+            <w:r>
+              <w:t>LOW</w:t>
+            </w:r>
+          </w:p>
+        </w:tc>
+        <w:tc>
+          <w:tcPr>
+            <w:tcW w:type="dxa" w:w="2160"/>
+          </w:tcPr>
+          <w:p>
+            <w:r>
+              <w:t>Logbook thumbnails vs mock</w:t>
+            </w:r>
+          </w:p>
+        </w:tc>
+        <w:tc>
+          <w:tcPr>
+            <w:tcW w:type="dxa" w:w="2160"/>
+          </w:tcPr>
+          <w:p>
+            <w:r>
+              <w:t>Open</w:t>
+            </w:r>
+          </w:p>
+        </w:tc>
+      </w:tr>
+    </w:tbl>
+    <w:p>
+      <w:pPr>
+        <w:pStyle w:val="Heading1"/>
+      </w:pPr>
+      <w:r>
+        <w:t>N. Priority Roadmap</w:t>
+      </w:r>
+    </w:p>
+    <w:p>
+      <w:pPr>
+        <w:pStyle w:val="ListBullet"/>
+      </w:pPr>
+      <w:r>
+        <w:t>Before compile/use: none (builds succeed).</w:t>
+      </w:r>
+    </w:p>
+    <w:p>
+      <w:pPr>
+        <w:pStyle w:val="ListBullet"/>
+      </w:pPr>
+      <w:r>
+        <w:t>Before TestFlight: R1 device QA; commit R2–R4 WIP.</w:t>
+      </w:r>
+    </w:p>
+    <w:p>
+      <w:pPr>
+        <w:pStyle w:val="ListBullet"/>
+      </w:pPr>
+      <w:r>
+        <w:t>Before App Store: R1 + legal/metadata + iCloud error visibility shipped.</w:t>
+      </w:r>
+    </w:p>
+    <w:p>
+      <w:pPr>
+        <w:pStyle w:val="ListBullet"/>
+      </w:pPr>
+      <w:r>
+        <w:t>Post-release: full i18n, GPX, iOS notifications, UI polish vs reference.</w:t>
+      </w:r>
+    </w:p>
+    <w:p>
+      <w:pPr>
+        <w:pStyle w:val="Heading1"/>
+      </w:pPr>
+      <w:r>
+        <w:t>O. Final Verdict</w:t>
+      </w:r>
+    </w:p>
+    <w:tbl>
+      <w:tblPr>
+        <w:tblStyle w:val="TableGrid"/>
+        <w:tblW w:type="auto" w:w="0"/>
+        <w:tblLook w:firstColumn="1" w:firstRow="1" w:lastColumn="0" w:lastRow="0" w:noHBand="0" w:noVBand="1" w:val="04A0"/>
+      </w:tblPr>
+      <w:tblGrid>
+        <w:gridCol w:w="2880"/>
+        <w:gridCol w:w="2880"/>
+        <w:gridCol w:w="2880"/>
+      </w:tblGrid>
+      <w:tr>
+        <w:tc>
+          <w:tcPr>
+            <w:tcW w:type="dxa" w:w="2880"/>
+          </w:tcPr>
+          <w:p>
+            <w:r>
+              <w:t>Question</w:t>
+            </w:r>
+          </w:p>
+        </w:tc>
+        <w:tc>
+          <w:tcPr>
+            <w:tcW w:type="dxa" w:w="2880"/>
+          </w:tcPr>
+          <w:p>
+            <w:r>
+              <w:t>db72dce</w:t>
+            </w:r>
+          </w:p>
+        </w:tc>
+        <w:tc>
+          <w:tcPr>
+            <w:tcW w:type="dxa" w:w="2880"/>
+          </w:tcPr>
+          <w:p>
+            <w:r>
+              <w:t>After WIP commit</w:t>
+            </w:r>
+          </w:p>
+        </w:tc>
+      </w:tr>
+      <w:tr>
+        <w:tc>
+          <w:tcPr>
+            <w:tcW w:type="dxa" w:w="2880"/>
+          </w:tcPr>
+          <w:p>
+            <w:r>
+              <w:t>Ready to compile?</w:t>
+            </w:r>
+          </w:p>
+        </w:tc>
+        <w:tc>
+          <w:tcPr>
+            <w:tcW w:type="dxa" w:w="2880"/>
+          </w:tcPr>
+          <w:p>
+            <w:r>
+              <w:t>YES</w:t>
+            </w:r>
+          </w:p>
+        </w:tc>
+        <w:tc>
+          <w:tcPr>
+            <w:tcW w:type="dxa" w:w="2880"/>
+          </w:tcPr>
+          <w:p>
+            <w:r>
+              <w:t>YES</w:t>
+            </w:r>
+          </w:p>
+        </w:tc>
+      </w:tr>
+      <w:tr>
+        <w:tc>
+          <w:tcPr>
+            <w:tcW w:type="dxa" w:w="2880"/>
+          </w:tcPr>
+          <w:p>
+            <w:r>
+              <w:t>Ready for internal test?</w:t>
+            </w:r>
+          </w:p>
+        </w:tc>
+        <w:tc>
+          <w:tcPr>
+            <w:tcW w:type="dxa" w:w="2880"/>
+          </w:tcPr>
+          <w:p>
+            <w:r>
+              <w:t>YES</w:t>
+            </w:r>
+          </w:p>
+        </w:tc>
+        <w:tc>
+          <w:tcPr>
+            <w:tcW w:type="dxa" w:w="2880"/>
+          </w:tcPr>
+          <w:p>
+            <w:r>
+              <w:t>YES</w:t>
+            </w:r>
+          </w:p>
+        </w:tc>
+      </w:tr>
+      <w:tr>
+        <w:tc>
+          <w:tcPr>
+            <w:tcW w:type="dxa" w:w="2880"/>
+          </w:tcPr>
+          <w:p>
+            <w:r>
+              <w:t>Ready for average user?</w:t>
+            </w:r>
+          </w:p>
+        </w:tc>
+        <w:tc>
+          <w:tcPr>
+            <w:tcW w:type="dxa" w:w="2880"/>
+          </w:tcPr>
+          <w:p>
+            <w:r>
+              <w:t>MOSTLY (~91%)</w:t>
+            </w:r>
+          </w:p>
+        </w:tc>
+        <w:tc>
+          <w:tcPr>
+            <w:tcW w:type="dxa" w:w="2880"/>
+          </w:tcPr>
+          <w:p>
+            <w:r>
+              <w:t>MOSTLY (~94%)</w:t>
+            </w:r>
+          </w:p>
+        </w:tc>
+      </w:tr>
+      <w:tr>
+        <w:tc>
+          <w:tcPr>
+            <w:tcW w:type="dxa" w:w="2880"/>
+          </w:tcPr>
+          <w:p>
+            <w:r>
+              <w:t>Ready for TestFlight?</w:t>
+            </w:r>
+          </w:p>
+        </w:tc>
+        <w:tc>
+          <w:tcPr>
+            <w:tcW w:type="dxa" w:w="2880"/>
+          </w:tcPr>
+          <w:p>
+            <w:r>
+              <w:t>YES after R1</w:t>
+            </w:r>
+          </w:p>
+        </w:tc>
+        <w:tc>
+          <w:tcPr>
+            <w:tcW w:type="dxa" w:w="2880"/>
+          </w:tcPr>
+          <w:p>
+            <w:r>
+              <w:t>YES after R1</w:t>
+            </w:r>
+          </w:p>
+        </w:tc>
+      </w:tr>
+      <w:tr>
+        <w:tc>
+          <w:tcPr>
+            <w:tcW w:type="dxa" w:w="2880"/>
+          </w:tcPr>
+          <w:p>
+            <w:r>
+              <w:t>Ready for App Store?</w:t>
+            </w:r>
+          </w:p>
+        </w:tc>
+        <w:tc>
+          <w:tcPr>
+            <w:tcW w:type="dxa" w:w="2880"/>
+          </w:tcPr>
+          <w:p>
+            <w:r>
+              <w:t>CONDITIONAL</w:t>
+            </w:r>
+          </w:p>
+        </w:tc>
+        <w:tc>
+          <w:tcPr>
+            <w:tcW w:type="dxa" w:w="2880"/>
+          </w:tcPr>
+          <w:p>
+            <w:r>
+              <w:t>CONDITIONAL</w:t>
+            </w:r>
+          </w:p>
+        </w:tc>
+      </w:tr>
+      <w:tr>
+        <w:tc>
+          <w:tcPr>
+            <w:tcW w:type="dxa" w:w="2880"/>
+          </w:tcPr>
+          <w:p>
+            <w:r>
+              <w:t>Blocks 100%</w:t>
+            </w:r>
+          </w:p>
+        </w:tc>
+        <w:tc>
+          <w:tcPr>
+            <w:tcW w:type="dxa" w:w="2880"/>
+          </w:tcPr>
+          <w:p>
+            <w:r>
+              <w:t>R1 hardware QA, store review, R2–R4 on remote</w:t>
+            </w:r>
+          </w:p>
+        </w:tc>
+        <w:tc>
+          <w:tcPr>
+            <w:tcW w:type="dxa" w:w="2880"/>
+          </w:tcPr>
+          <w:p>
+            <w:r>
+              <w:t>Primarily R1 + metadata</w:t>
+            </w:r>
+          </w:p>
+        </w:tc>
+      </w:tr>
+    </w:tbl>
+    <w:p>
+      <w:pPr>
+        <w:pStyle w:val="Heading1"/>
+      </w:pPr>
+      <w:r>
+        <w:t>Prior fixes on main</w:t>
+      </w:r>
+    </w:p>
+    <w:p>
+      <w:pPr>
+        <w:pStyle w:val="ListBullet"/>
+      </w:pPr>
+      <w:r>
+        <w:t>876bcd2: manual edit, merge fields, planner mock row, disclaimer persist, sync fixes.</w:t>
+      </w:r>
+    </w:p>
+    <w:p>
+      <w:pPr>
+        <w:pStyle w:val="ListBullet"/>
+      </w:pPr>
+      <w:r>
+        <w:t>db72dce: ascent gauge imperial, 7 App Shortcuts, shortcut help, detail refresh.</w:t>
+      </w:r>
+    </w:p>
+    <w:p>
+      <w:pPr>
+        <w:pStyle w:val="Heading1"/>
+      </w:pPr>
+      <w:r>
+        <w:t>Reference UI</w:t>
       </w:r>
     </w:p>
     <w:p>
@@ -307,16 +1856,16 @@
       <w:r>
         <w:rPr>
           <w:b w:val="0"/>
-          <w:sz w:val="20"/>
+          <w:sz w:val="18"/>
         </w:rPr>
-        <w:t>Watch reference: Watch_LIVE_reference.png</w:t>
+        <w:t>Watch LIVE reference</w:t>
       </w:r>
     </w:p>
     <w:p>
       <w:r>
         <w:drawing>
           <wp:inline xmlns:a="http://schemas.openxmlformats.org/drawingml/2006/main" xmlns:pic="http://schemas.openxmlformats.org/drawingml/2006/picture">
-            <wp:extent cx="2560320" cy="1705213"/>
+            <wp:extent cx="2011680" cy="1339810"/>
             <wp:docPr id="2" name="Picture 2"/>
             <wp:cNvGraphicFramePr>
               <a:graphicFrameLocks noChangeAspect="1"/>
@@ -337,7 +1886,7 @@
                   <pic:spPr>
                     <a:xfrm>
                       <a:off x="0" y="0"/>
-                      <a:ext cx="2560320" cy="1705213"/>
+                      <a:ext cx="2011680" cy="1339810"/>
                     </a:xfrm>
                     <a:prstGeom prst="rect"/>
                   </pic:spPr>
@@ -352,1310 +1901,18 @@
       <w:r>
         <w:rPr>
           <w:b w:val="0"/>
-          <w:sz w:val="20"/>
+          <w:sz w:val="18"/>
         </w:rPr>
-        <w:t>iOS reference: iOS_Companion_reference.png</w:t>
-      </w:r>
-    </w:p>
-    <w:p>
-      <w:pPr>
-        <w:pStyle w:val="Heading1"/>
-      </w:pPr>
-      <w:r>
-        <w:t>C. Feature Inventory (summary)</w:t>
-      </w:r>
-    </w:p>
-    <w:tbl>
-      <w:tblPr>
-        <w:tblStyle w:val="TableGrid"/>
-        <w:tblW w:type="auto" w:w="0"/>
-        <w:tblLook w:firstColumn="1" w:firstRow="1" w:lastColumn="0" w:lastRow="0" w:noHBand="0" w:noVBand="1" w:val="04A0"/>
-      </w:tblPr>
-      <w:tblGrid>
-        <w:gridCol w:w="1728"/>
-        <w:gridCol w:w="1728"/>
-        <w:gridCol w:w="1728"/>
-        <w:gridCol w:w="1728"/>
-        <w:gridCol w:w="1728"/>
-      </w:tblGrid>
-      <w:tr>
-        <w:tc>
-          <w:tcPr>
-            <w:tcW w:type="dxa" w:w="1728"/>
-          </w:tcPr>
-          <w:p>
-            <w:r>
-              <w:t>Platform</w:t>
-            </w:r>
-          </w:p>
-        </w:tc>
-        <w:tc>
-          <w:tcPr>
-            <w:tcW w:type="dxa" w:w="1728"/>
-          </w:tcPr>
-          <w:p>
-            <w:r>
-              <w:t>Feature</w:t>
-            </w:r>
-          </w:p>
-        </w:tc>
-        <w:tc>
-          <w:tcPr>
-            <w:tcW w:type="dxa" w:w="1728"/>
-          </w:tcPr>
-          <w:p>
-            <w:r>
-              <w:t>Complete</w:t>
-            </w:r>
-          </w:p>
-        </w:tc>
-        <w:tc>
-          <w:tcPr>
-            <w:tcW w:type="dxa" w:w="1728"/>
-          </w:tcPr>
-          <w:p>
-            <w:r>
-              <w:t>Severity</w:t>
-            </w:r>
-          </w:p>
-        </w:tc>
-        <w:tc>
-          <w:tcPr>
-            <w:tcW w:type="dxa" w:w="1728"/>
-          </w:tcPr>
-          <w:p>
-            <w:r>
-              <w:t>Notes</w:t>
-            </w:r>
-          </w:p>
-        </w:tc>
-      </w:tr>
-      <w:tr>
-        <w:tc>
-          <w:tcPr>
-            <w:tcW w:type="dxa" w:w="1728"/>
-          </w:tcPr>
-          <w:p>
-            <w:r>
-              <w:t>Watch</w:t>
-            </w:r>
-          </w:p>
-        </w:tc>
-        <w:tc>
-          <w:tcPr>
-            <w:tcW w:type="dxa" w:w="1728"/>
-          </w:tcPr>
-          <w:p>
-            <w:r>
-              <w:t>Live dive + ascent banner</w:t>
-            </w:r>
-          </w:p>
-        </w:tc>
-        <w:tc>
-          <w:tcPr>
-            <w:tcW w:type="dxa" w:w="1728"/>
-          </w:tcPr>
-          <w:p>
-            <w:r>
-              <w:t>Y</w:t>
-            </w:r>
-          </w:p>
-        </w:tc>
-        <w:tc>
-          <w:tcPr>
-            <w:tcW w:type="dxa" w:w="1728"/>
-          </w:tcPr>
-          <w:p>
-            <w:r>
-              <w:t>—</w:t>
-            </w:r>
-          </w:p>
-        </w:tc>
-        <w:tc>
-          <w:tcPr>
-            <w:tcW w:type="dxa" w:w="1728"/>
-          </w:tcPr>
-          <w:p>
-            <w:r>
-              <w:t>Inline banner; gauge visible</w:t>
-            </w:r>
-          </w:p>
-        </w:tc>
-      </w:tr>
-      <w:tr>
-        <w:tc>
-          <w:tcPr>
-            <w:tcW w:type="dxa" w:w="1728"/>
-          </w:tcPr>
-          <w:p>
-            <w:r>
-              <w:t>Watch</w:t>
-            </w:r>
-          </w:p>
-        </w:tc>
-        <w:tc>
-          <w:tcPr>
-            <w:tcW w:type="dxa" w:w="1728"/>
-          </w:tcPr>
-          <w:p>
-            <w:r>
-              <w:t>BUSSOLA / bearing</w:t>
-            </w:r>
-          </w:p>
-        </w:tc>
-        <w:tc>
-          <w:tcPr>
-            <w:tcW w:type="dxa" w:w="1728"/>
-          </w:tcPr>
-          <w:p>
-            <w:r>
-              <w:t>Y</w:t>
-            </w:r>
-          </w:p>
-        </w:tc>
-        <w:tc>
-          <w:tcPr>
-            <w:tcW w:type="dxa" w:w="1728"/>
-          </w:tcPr>
-          <w:p>
-            <w:r>
-              <w:t>—</w:t>
-            </w:r>
-          </w:p>
-        </w:tc>
-        <w:tc>
-          <w:tcPr>
-            <w:tcW w:type="dxa" w:w="1728"/>
-          </w:tcPr>
-          <w:p>
-            <w:r>
-              <w:t>BUSSOLA terminology</w:t>
-            </w:r>
-          </w:p>
-        </w:tc>
-      </w:tr>
-      <w:tr>
-        <w:tc>
-          <w:tcPr>
-            <w:tcW w:type="dxa" w:w="1728"/>
-          </w:tcPr>
-          <w:p>
-            <w:r>
-              <w:t>Watch</w:t>
-            </w:r>
-          </w:p>
-        </w:tc>
-        <w:tc>
-          <w:tcPr>
-            <w:tcW w:type="dxa" w:w="1728"/>
-          </w:tcPr>
-          <w:p>
-            <w:r>
-              <w:t>GPS start/end</w:t>
-            </w:r>
-          </w:p>
-        </w:tc>
-        <w:tc>
-          <w:tcPr>
-            <w:tcW w:type="dxa" w:w="1728"/>
-          </w:tcPr>
-          <w:p>
-            <w:r>
-              <w:t>Y</w:t>
-            </w:r>
-          </w:p>
-        </w:tc>
-        <w:tc>
-          <w:tcPr>
-            <w:tcW w:type="dxa" w:w="1728"/>
-          </w:tcPr>
-          <w:p>
-            <w:r>
-              <w:t>—</w:t>
-            </w:r>
-          </w:p>
-        </w:tc>
-        <w:tc>
-          <w:tcPr>
-            <w:tcW w:type="dxa" w:w="1728"/>
-          </w:tcPr>
-          <w:p>
-            <w:r>
-              <w:t>Compact banner ~1.4s (a75a6c3)</w:t>
-            </w:r>
-          </w:p>
-        </w:tc>
-      </w:tr>
-      <w:tr>
-        <w:tc>
-          <w:tcPr>
-            <w:tcW w:type="dxa" w:w="1728"/>
-          </w:tcPr>
-          <w:p>
-            <w:r>
-              <w:t>Watch</w:t>
-            </w:r>
-          </w:p>
-        </w:tc>
-        <w:tc>
-          <w:tcPr>
-            <w:tcW w:type="dxa" w:w="1728"/>
-          </w:tcPr>
-          <w:p>
-            <w:r>
-              <w:t>iPhone → Watch sync</w:t>
-            </w:r>
-          </w:p>
-        </w:tc>
-        <w:tc>
-          <w:tcPr>
-            <w:tcW w:type="dxa" w:w="1728"/>
-          </w:tcPr>
-          <w:p>
-            <w:r>
-              <w:t>Partial</w:t>
-            </w:r>
-          </w:p>
-        </w:tc>
-        <w:tc>
-          <w:tcPr>
-            <w:tcW w:type="dxa" w:w="1728"/>
-          </w:tcPr>
-          <w:p>
-            <w:r>
-              <w:t>MED</w:t>
-            </w:r>
-          </w:p>
-        </w:tc>
-        <w:tc>
-          <w:tcPr>
-            <w:tcW w:type="dxa" w:w="1728"/>
-          </w:tcPr>
-          <w:p>
-            <w:r>
-              <w:t>didReceive* implemented; device QA needed</w:t>
-            </w:r>
-          </w:p>
-        </w:tc>
-      </w:tr>
-      <w:tr>
-        <w:tc>
-          <w:tcPr>
-            <w:tcW w:type="dxa" w:w="1728"/>
-          </w:tcPr>
-          <w:p>
-            <w:r>
-              <w:t>Watch</w:t>
-            </w:r>
-          </w:p>
-        </w:tc>
-        <w:tc>
-          <w:tcPr>
-            <w:tcW w:type="dxa" w:w="1728"/>
-          </w:tcPr>
-          <w:p>
-            <w:r>
-              <w:t>Alarm dismiss OK</w:t>
-            </w:r>
-          </w:p>
-        </w:tc>
-        <w:tc>
-          <w:tcPr>
-            <w:tcW w:type="dxa" w:w="1728"/>
-          </w:tcPr>
-          <w:p>
-            <w:r>
-              <w:t>Y</w:t>
-            </w:r>
-          </w:p>
-        </w:tc>
-        <w:tc>
-          <w:tcPr>
-            <w:tcW w:type="dxa" w:w="1728"/>
-          </w:tcPr>
-          <w:p>
-            <w:r>
-              <w:t>—</w:t>
-            </w:r>
-          </w:p>
-        </w:tc>
-        <w:tc>
-          <w:tcPr>
-            <w:tcW w:type="dxa" w:w="1728"/>
-          </w:tcPr>
-          <w:p>
-            <w:r>
-              <w:t>15s cooldown</w:t>
-            </w:r>
-          </w:p>
-        </w:tc>
-      </w:tr>
-      <w:tr>
-        <w:tc>
-          <w:tcPr>
-            <w:tcW w:type="dxa" w:w="1728"/>
-          </w:tcPr>
-          <w:p>
-            <w:r>
-              <w:t>iOS</w:t>
-            </w:r>
-          </w:p>
-        </w:tc>
-        <w:tc>
-          <w:tcPr>
-            <w:tcW w:type="dxa" w:w="1728"/>
-          </w:tcPr>
-          <w:p>
-            <w:r>
-              <w:t>Logbook / detail / export</w:t>
-            </w:r>
-          </w:p>
-        </w:tc>
-        <w:tc>
-          <w:tcPr>
-            <w:tcW w:type="dxa" w:w="1728"/>
-          </w:tcPr>
-          <w:p>
-            <w:r>
-              <w:t>Y</w:t>
-            </w:r>
-          </w:p>
-        </w:tc>
-        <w:tc>
-          <w:tcPr>
-            <w:tcW w:type="dxa" w:w="1728"/>
-          </w:tcPr>
-          <w:p>
-            <w:r>
-              <w:t>—</w:t>
-            </w:r>
-          </w:p>
-        </w:tc>
-        <w:tc>
-          <w:tcPr>
-            <w:tcW w:type="dxa" w:w="1728"/>
-          </w:tcPr>
-          <w:p>
-            <w:r/>
-          </w:p>
-        </w:tc>
-      </w:tr>
-      <w:tr>
-        <w:tc>
-          <w:tcPr>
-            <w:tcW w:type="dxa" w:w="1728"/>
-          </w:tcPr>
-          <w:p>
-            <w:r>
-              <w:t>iOS</w:t>
-            </w:r>
-          </w:p>
-        </w:tc>
-        <w:tc>
-          <w:tcPr>
-            <w:tcW w:type="dxa" w:w="1728"/>
-          </w:tcPr>
-          <w:p>
-            <w:r>
-              <w:t>Planner + Bühlmann</w:t>
-            </w:r>
-          </w:p>
-        </w:tc>
-        <w:tc>
-          <w:tcPr>
-            <w:tcW w:type="dxa" w:w="1728"/>
-          </w:tcPr>
-          <w:p>
-            <w:r>
-              <w:t>Partial</w:t>
-            </w:r>
-          </w:p>
-        </w:tc>
-        <w:tc>
-          <w:tcPr>
-            <w:tcW w:type="dxa" w:w="1728"/>
-          </w:tcPr>
-          <w:p>
-            <w:r>
-              <w:t>MED</w:t>
-            </w:r>
-          </w:p>
-        </w:tc>
-        <w:tc>
-          <w:tcPr>
-            <w:tcW w:type="dxa" w:w="1728"/>
-          </w:tcPr>
-          <w:p>
-            <w:r>
-              <w:t>Indicative disclaimer</w:t>
-            </w:r>
-          </w:p>
-        </w:tc>
-      </w:tr>
-      <w:tr>
-        <w:tc>
-          <w:tcPr>
-            <w:tcW w:type="dxa" w:w="1728"/>
-          </w:tcPr>
-          <w:p>
-            <w:r>
-              <w:t>iOS</w:t>
-            </w:r>
-          </w:p>
-        </w:tc>
-        <w:tc>
-          <w:tcPr>
-            <w:tcW w:type="dxa" w:w="1728"/>
-          </w:tcPr>
-          <w:p>
-            <w:r>
-              <w:t>Watch import + tombstone</w:t>
-            </w:r>
-          </w:p>
-        </w:tc>
-        <w:tc>
-          <w:tcPr>
-            <w:tcW w:type="dxa" w:w="1728"/>
-          </w:tcPr>
-          <w:p>
-            <w:r>
-              <w:t>Partial</w:t>
-            </w:r>
-          </w:p>
-        </w:tc>
-        <w:tc>
-          <w:tcPr>
-            <w:tcW w:type="dxa" w:w="1728"/>
-          </w:tcPr>
-          <w:p>
-            <w:r>
-              <w:t>MED</w:t>
-            </w:r>
-          </w:p>
-        </w:tc>
-        <w:tc>
-          <w:tcPr>
-            <w:tcW w:type="dxa" w:w="1728"/>
-          </w:tcPr>
-          <w:p>
-            <w:r>
-              <w:t>Shared key; QA on device</w:t>
-            </w:r>
-          </w:p>
-        </w:tc>
-      </w:tr>
-      <w:tr>
-        <w:tc>
-          <w:tcPr>
-            <w:tcW w:type="dxa" w:w="1728"/>
-          </w:tcPr>
-          <w:p>
-            <w:r>
-              <w:t>Both</w:t>
-            </w:r>
-          </w:p>
-        </w:tc>
-        <w:tc>
-          <w:tcPr>
-            <w:tcW w:type="dxa" w:w="1728"/>
-          </w:tcPr>
-          <w:p>
-            <w:r>
-              <w:t>Secondary i18n</w:t>
-            </w:r>
-          </w:p>
-        </w:tc>
-        <w:tc>
-          <w:tcPr>
-            <w:tcW w:type="dxa" w:w="1728"/>
-          </w:tcPr>
-          <w:p>
-            <w:r>
-              <w:t>Partial</w:t>
-            </w:r>
-          </w:p>
-        </w:tc>
-        <w:tc>
-          <w:tcPr>
-            <w:tcW w:type="dxa" w:w="1728"/>
-          </w:tcPr>
-          <w:p>
-            <w:r>
-              <w:t>LOW</w:t>
-            </w:r>
-          </w:p>
-        </w:tc>
-        <w:tc>
-          <w:tcPr>
-            <w:tcW w:type="dxa" w:w="1728"/>
-          </w:tcPr>
-          <w:p>
-            <w:r>
-              <w:t>~240 EN keys; planner gaps remain</w:t>
-            </w:r>
-          </w:p>
-        </w:tc>
-      </w:tr>
-    </w:tbl>
-    <w:p>
-      <w:pPr>
-        <w:pStyle w:val="Heading1"/>
-      </w:pPr>
-      <w:r>
-        <w:t>D. Navigation Map</w:t>
-      </w:r>
-    </w:p>
-    <w:p>
-      <w:r>
-        <w:rPr>
-          <w:b/>
-          <w:sz w:val="20"/>
-        </w:rPr>
-        <w:t>Watch: Mode Selection → Live; tabs: Mode | Live | BUSSOLA | Settings | Images | Log.</w:t>
-      </w:r>
-    </w:p>
-    <w:p>
-      <w:r>
-        <w:rPr>
-          <w:b/>
-          <w:sz w:val="20"/>
-        </w:rPr>
-        <w:t>iOS: Logbook | Analisi | Planner | Attrezzatura | Altro.</w:t>
-      </w:r>
-    </w:p>
-    <w:p>
-      <w:pPr>
-        <w:pStyle w:val="Heading1"/>
-      </w:pPr>
-      <w:r>
-        <w:t>E. UI Consistency</w:t>
-      </w:r>
-    </w:p>
-    <w:p>
-      <w:pPr>
-        <w:pStyle w:val="ListBullet"/>
-      </w:pPr>
-      <w:r>
-        <w:t>Watch: high match to black/neon DiveUI; GPS now compact banner (aligned with reference intent).</w:t>
-      </w:r>
-    </w:p>
-    <w:p>
-      <w:pPr>
-        <w:pStyle w:val="ListBullet"/>
-      </w:pPr>
-      <w:r>
-        <w:t>iOS: high match to DIRTheme dark marine + cyan; verify AppIcon in Xcode archive.</w:t>
-      </w:r>
-    </w:p>
-    <w:p>
-      <w:pPr>
-        <w:pStyle w:val="ListBullet"/>
-      </w:pPr>
-      <w:r>
-        <w:t>i18n: improved secondary pass; residual IT on planner/GPS detail possible.</w:t>
-      </w:r>
-    </w:p>
-    <w:p>
-      <w:pPr>
-        <w:pStyle w:val="Heading1"/>
-      </w:pPr>
-      <w:r>
-        <w:t>F. Settings</w:t>
-      </w:r>
-    </w:p>
-    <w:p>
-      <w:pPr>
-        <w:pStyle w:val="ListBullet"/>
-      </w:pPr>
-      <w:r>
-        <w:t>Watch: ascent limits, alarms, haptics, language — persisted; settings sync to iPhone planned only.</w:t>
-      </w:r>
-    </w:p>
-    <w:p>
-      <w:pPr>
-        <w:pStyle w:val="ListBullet"/>
-      </w:pPr>
-      <w:r>
-        <w:t>iOS: language editable; units/export read-only; cloud sync trigger; demo logbook for review.</w:t>
-      </w:r>
-    </w:p>
-    <w:p>
-      <w:pPr>
-        <w:pStyle w:val="Heading1"/>
-      </w:pPr>
-      <w:r>
-        <w:t>G. Haptics / Tones</w:t>
-      </w:r>
-    </w:p>
-    <w:p>
-      <w:pPr>
-        <w:pStyle w:val="ListBullet"/>
-      </w:pPr>
-      <w:r>
-        <w:t>Watch: haptics for stopwatch, ascent alarm, alarms, compass, export — gated by toggle.</w:t>
-      </w:r>
-    </w:p>
-    <w:p>
-      <w:pPr>
-        <w:pStyle w:val="ListBullet"/>
-      </w:pPr>
-      <w:r>
-        <w:t>Watch: alarm OK dismiss on live screen (SAF-8 fixed).</w:t>
-      </w:r>
-    </w:p>
-    <w:p>
-      <w:pPr>
-        <w:pStyle w:val="ListBullet"/>
-      </w:pPr>
-      <w:r>
-        <w:t>iOS: no alert sounds; visual feedback only.</w:t>
-      </w:r>
-    </w:p>
-    <w:p>
-      <w:pPr>
-        <w:pStyle w:val="Heading1"/>
-      </w:pPr>
-      <w:r>
-        <w:t>H. Hardware</w:t>
+        <w:t>iOS Companion reference</w:t>
       </w:r>
     </w:p>
     <w:p>
       <w:r>
         <w:rPr>
           <w:b w:val="0"/>
-          <w:sz w:val="20"/>
-        </w:rPr>
-        <w:t>App Intents: manual dive, bearing, alarm acknowledge, stopwatch. Side button not mapped (documented in WatchShortcutHelpView).</w:t>
-      </w:r>
-    </w:p>
-    <w:p>
-      <w:pPr>
-        <w:pStyle w:val="Heading1"/>
-      </w:pPr>
-      <w:r>
-        <w:t>I. Sync</w:t>
-      </w:r>
-    </w:p>
-    <w:p>
-      <w:pPr>
-        <w:pStyle w:val="ListBullet"/>
-      </w:pPr>
-      <w:r>
-        <w:t>FIXED: Watch didReceiveMessage / didReceiveUserInfo (a75a6c3).</w:t>
-      </w:r>
-    </w:p>
-    <w:p>
-      <w:pPr>
-        <w:pStyle w:val="ListBullet"/>
-      </w:pPr>
-      <w:r>
-        <w:t>FIXED: dirdiving_shared_deleted_session_ids + WC tombstone broadcast.</w:t>
-      </w:r>
-    </w:p>
-    <w:p>
-      <w:pPr>
-        <w:pStyle w:val="ListBullet"/>
-      </w:pPr>
-      <w:r>
-        <w:t>Watch → iPhone outbound queue + signed ack implemented.</w:t>
-      </w:r>
-    </w:p>
-    <w:p>
-      <w:pPr>
-        <w:pStyle w:val="ListBullet"/>
-      </w:pPr>
-      <w:r>
-        <w:t>REMAINING: first-pairing education; per-session delivery UI; physical QA.</w:t>
-      </w:r>
-    </w:p>
-    <w:p>
-      <w:pPr>
-        <w:pStyle w:val="Heading1"/>
-      </w:pPr>
-      <w:r>
-        <w:t>J. Export</w:t>
-      </w:r>
-    </w:p>
-    <w:p>
-      <w:r>
-        <w:rPr>
-          <w:b w:val="0"/>
-          <w:sz w:val="20"/>
-        </w:rPr>
-        <w:t>Subsurface CSV on Watch and iOS; GPX/KML not on MAIN. Share/error feedback present.</w:t>
-      </w:r>
-    </w:p>
-    <w:p>
-      <w:pPr>
-        <w:pStyle w:val="Heading1"/>
-      </w:pPr>
-      <w:r>
-        <w:t>K. Safety</w:t>
-      </w:r>
-    </w:p>
-    <w:p>
-      <w:pPr>
-        <w:pStyle w:val="ListBullet"/>
-      </w:pPr>
-      <w:r>
-        <w:t>Not presented as certified dive computer.</w:t>
-      </w:r>
-    </w:p>
-    <w:p>
-      <w:pPr>
-        <w:pStyle w:val="ListBullet"/>
-      </w:pPr>
-      <w:r>
-        <w:t>Planner and TTV marked indicative in UI/README/More.</w:t>
-      </w:r>
-    </w:p>
-    <w:p>
-      <w:pPr>
-        <w:pStyle w:val="ListBullet"/>
-      </w:pPr>
-      <w:r>
-        <w:t>Water submersion entitlement configured; real Ultra validation still required.</w:t>
-      </w:r>
-    </w:p>
-    <w:p>
-      <w:pPr>
-        <w:pStyle w:val="Heading1"/>
-      </w:pPr>
-      <w:r>
-        <w:t>L. Error / Empty states</w:t>
-      </w:r>
-    </w:p>
-    <w:p>
-      <w:r>
-        <w:rPr>
-          <w:b w:val="0"/>
-          <w:sz w:val="20"/>
-        </w:rPr>
-        <w:t>Logbook and Analysis empty states with real actions (import, sync). GPS/depth failures labeled.</w:t>
-      </w:r>
-    </w:p>
-    <w:p>
-      <w:pPr>
-        <w:pStyle w:val="Heading1"/>
-      </w:pPr>
-      <w:r>
-        <w:t>M. Bugs To Fix (top)</w:t>
-      </w:r>
-    </w:p>
-    <w:tbl>
-      <w:tblPr>
-        <w:tblStyle w:val="TableGrid"/>
-        <w:tblW w:type="auto" w:w="0"/>
-        <w:tblLook w:firstColumn="1" w:firstRow="1" w:lastColumn="0" w:lastRow="0" w:noHBand="0" w:noVBand="1" w:val="04A0"/>
-      </w:tblPr>
-      <w:tblGrid>
-        <w:gridCol w:w="2160"/>
-        <w:gridCol w:w="2160"/>
-        <w:gridCol w:w="2160"/>
-        <w:gridCol w:w="2160"/>
-      </w:tblGrid>
-      <w:tr>
-        <w:tc>
-          <w:tcPr>
-            <w:tcW w:type="dxa" w:w="2160"/>
-          </w:tcPr>
-          <w:p>
-            <w:r>
-              <w:t>#</w:t>
-            </w:r>
-          </w:p>
-        </w:tc>
-        <w:tc>
-          <w:tcPr>
-            <w:tcW w:type="dxa" w:w="2160"/>
-          </w:tcPr>
-          <w:p>
-            <w:r>
-              <w:t>Title</w:t>
-            </w:r>
-          </w:p>
-        </w:tc>
-        <w:tc>
-          <w:tcPr>
-            <w:tcW w:type="dxa" w:w="2160"/>
-          </w:tcPr>
-          <w:p>
-            <w:r>
-              <w:t>Sev.</w:t>
-            </w:r>
-          </w:p>
-        </w:tc>
-        <w:tc>
-          <w:tcPr>
-            <w:tcW w:type="dxa" w:w="2160"/>
-          </w:tcPr>
-          <w:p>
-            <w:r>
-              <w:t>Fix type</w:t>
-            </w:r>
-          </w:p>
-        </w:tc>
-      </w:tr>
-      <w:tr>
-        <w:tc>
-          <w:tcPr>
-            <w:tcW w:type="dxa" w:w="2160"/>
-          </w:tcPr>
-          <w:p>
-            <w:r>
-              <w:t>1</w:t>
-            </w:r>
-          </w:p>
-        </w:tc>
-        <w:tc>
-          <w:tcPr>
-            <w:tcW w:type="dxa" w:w="2160"/>
-          </w:tcPr>
-          <w:p>
-            <w:r>
-              <w:t>Depth entitlement not validated on real Ultra</w:t>
-            </w:r>
-          </w:p>
-        </w:tc>
-        <w:tc>
-          <w:tcPr>
-            <w:tcW w:type="dxa" w:w="2160"/>
-          </w:tcPr>
-          <w:p>
-            <w:r>
-              <w:t>HIGH</w:t>
-            </w:r>
-          </w:p>
-        </w:tc>
-        <w:tc>
-          <w:tcPr>
-            <w:tcW w:type="dxa" w:w="2160"/>
-          </w:tcPr>
-          <w:p>
-            <w:r>
-              <w:t>Process / QA</w:t>
-            </w:r>
-          </w:p>
-        </w:tc>
-      </w:tr>
-      <w:tr>
-        <w:tc>
-          <w:tcPr>
-            <w:tcW w:type="dxa" w:w="2160"/>
-          </w:tcPr>
-          <w:p>
-            <w:r>
-              <w:t>2</w:t>
-            </w:r>
-          </w:p>
-        </w:tc>
-        <w:tc>
-          <w:tcPr>
-            <w:tcW w:type="dxa" w:w="2160"/>
-          </w:tcPr>
-          <w:p>
-            <w:r>
-              <w:t>First-pairing sync appears broken without docs</w:t>
-            </w:r>
-          </w:p>
-        </w:tc>
-        <w:tc>
-          <w:tcPr>
-            <w:tcW w:type="dxa" w:w="2160"/>
-          </w:tcPr>
-          <w:p>
-            <w:r>
-              <w:t>MED</w:t>
-            </w:r>
-          </w:p>
-        </w:tc>
-        <w:tc>
-          <w:tcPr>
-            <w:tcW w:type="dxa" w:w="2160"/>
-          </w:tcPr>
-          <w:p>
-            <w:r>
-              <w:t>Process + copy</w:t>
-            </w:r>
-          </w:p>
-        </w:tc>
-      </w:tr>
-      <w:tr>
-        <w:tc>
-          <w:tcPr>
-            <w:tcW w:type="dxa" w:w="2160"/>
-          </w:tcPr>
-          <w:p>
-            <w:r>
-              <w:t>3</w:t>
-            </w:r>
-          </w:p>
-        </w:tc>
-        <w:tc>
-          <w:tcPr>
-            <w:tcW w:type="dxa" w:w="2160"/>
-          </w:tcPr>
-          <w:p>
-            <w:r>
-              <w:t>Mode Selection extra launch step</w:t>
-            </w:r>
-          </w:p>
-        </w:tc>
-        <w:tc>
-          <w:tcPr>
-            <w:tcW w:type="dxa" w:w="2160"/>
-          </w:tcPr>
-          <w:p>
-            <w:r>
-              <w:t>LOW</w:t>
-            </w:r>
-          </w:p>
-        </w:tc>
-        <w:tc>
-          <w:tcPr>
-            <w:tcW w:type="dxa" w:w="2160"/>
-          </w:tcPr>
-          <w:p>
-            <w:r>
-              <w:t>UI-only</w:t>
-            </w:r>
-          </w:p>
-        </w:tc>
-      </w:tr>
-      <w:tr>
-        <w:tc>
-          <w:tcPr>
-            <w:tcW w:type="dxa" w:w="2160"/>
-          </w:tcPr>
-          <w:p>
-            <w:r>
-              <w:t>4</w:t>
-            </w:r>
-          </w:p>
-        </w:tc>
-        <w:tc>
-          <w:tcPr>
-            <w:tcW w:type="dxa" w:w="2160"/>
-          </w:tcPr>
-          <w:p>
-            <w:r>
-              <w:t>UserImages tab when bundle empty</w:t>
-            </w:r>
-          </w:p>
-        </w:tc>
-        <w:tc>
-          <w:tcPr>
-            <w:tcW w:type="dxa" w:w="2160"/>
-          </w:tcPr>
-          <w:p>
-            <w:r>
-              <w:t>LOW</w:t>
-            </w:r>
-          </w:p>
-        </w:tc>
-        <w:tc>
-          <w:tcPr>
-            <w:tcW w:type="dxa" w:w="2160"/>
-          </w:tcPr>
-          <w:p>
-            <w:r>
-              <w:t>UI-only</w:t>
-            </w:r>
-          </w:p>
-        </w:tc>
-      </w:tr>
-      <w:tr>
-        <w:tc>
-          <w:tcPr>
-            <w:tcW w:type="dxa" w:w="2160"/>
-          </w:tcPr>
-          <w:p>
-            <w:r>
-              <w:t>5</w:t>
-            </w:r>
-          </w:p>
-        </w:tc>
-        <w:tc>
-          <w:tcPr>
-            <w:tcW w:type="dxa" w:w="2160"/>
-          </w:tcPr>
-          <w:p>
-            <w:r>
-              <w:t>Residual i18n planner/GPS detail</w:t>
-            </w:r>
-          </w:p>
-        </w:tc>
-        <w:tc>
-          <w:tcPr>
-            <w:tcW w:type="dxa" w:w="2160"/>
-          </w:tcPr>
-          <w:p>
-            <w:r>
-              <w:t>LOW</w:t>
-            </w:r>
-          </w:p>
-        </w:tc>
-        <w:tc>
-          <w:tcPr>
-            <w:tcW w:type="dxa" w:w="2160"/>
-          </w:tcPr>
-          <w:p>
-            <w:r>
-              <w:t>UI-only</w:t>
-            </w:r>
-          </w:p>
-        </w:tc>
-      </w:tr>
-      <w:tr>
-        <w:tc>
-          <w:tcPr>
-            <w:tcW w:type="dxa" w:w="2160"/>
-          </w:tcPr>
-          <w:p>
-            <w:r>
-              <w:t>6</w:t>
-            </w:r>
-          </w:p>
-        </w:tc>
-        <w:tc>
-          <w:tcPr>
-            <w:tcW w:type="dxa" w:w="2160"/>
-          </w:tcPr>
-          <w:p>
-            <w:r>
-              <w:t>iOS AppIcon archive completeness</w:t>
-            </w:r>
-          </w:p>
-        </w:tc>
-        <w:tc>
-          <w:tcPr>
-            <w:tcW w:type="dxa" w:w="2160"/>
-          </w:tcPr>
-          <w:p>
-            <w:r>
-              <w:t>MED</w:t>
-            </w:r>
-          </w:p>
-        </w:tc>
-        <w:tc>
-          <w:tcPr>
-            <w:tcW w:type="dxa" w:w="2160"/>
-          </w:tcPr>
-          <w:p>
-            <w:r>
-              <w:t>Assets</w:t>
-            </w:r>
-          </w:p>
-        </w:tc>
-      </w:tr>
-    </w:tbl>
-    <w:p>
-      <w:r>
-        <w:rPr>
-          <w:b/>
-          <w:sz w:val="20"/>
-        </w:rPr>
-        <w:t>Resolved: Watch inbound WC, tombstones, GPS banner, alarm dismiss, simulator builds.</w:t>
-      </w:r>
-    </w:p>
-    <w:p>
-      <w:pPr>
-        <w:pStyle w:val="Heading1"/>
-      </w:pPr>
-      <w:r>
-        <w:t>N. Priority Roadmap</w:t>
-      </w:r>
-    </w:p>
-    <w:p>
-      <w:pPr>
-        <w:pStyle w:val="ListBullet"/>
-      </w:pPr>
-      <w:r>
-        <w:t>Before compile/use: simulator builds OK; verify signing + entitlements on portal.</w:t>
-      </w:r>
-    </w:p>
-    <w:p>
-      <w:pPr>
-        <w:pStyle w:val="ListBullet"/>
-      </w:pPr>
-      <w:r>
-        <w:t>Before TestFlight: Ultra depth smoke test + bidirectional sync on physical devices.</w:t>
-      </w:r>
-    </w:p>
-    <w:p>
-      <w:pPr>
-        <w:pStyle w:val="ListBullet"/>
-      </w:pPr>
-      <w:r>
-        <w:t>Before App Store: legal/privacy, primary-flow i18n, App icon/screenshots.</w:t>
-      </w:r>
-    </w:p>
-    <w:p>
-      <w:pPr>
-        <w:pStyle w:val="ListBullet"/>
-      </w:pPr>
-      <w:r>
-        <w:t>Post-release: skip Mode Selection, hide empty UserImages, GPX, settings sync.</w:t>
-      </w:r>
-    </w:p>
-    <w:p>
-      <w:pPr>
-        <w:pStyle w:val="Heading1"/>
-      </w:pPr>
-      <w:r>
-        <w:t>O. Final Verdict</w:t>
-      </w:r>
-    </w:p>
-    <w:tbl>
-      <w:tblPr>
-        <w:tblStyle w:val="TableGrid"/>
-        <w:tblW w:type="auto" w:w="0"/>
-        <w:tblLook w:firstColumn="1" w:firstRow="1" w:lastColumn="0" w:lastRow="0" w:noHBand="0" w:noVBand="1" w:val="04A0"/>
-      </w:tblPr>
-      <w:tblGrid>
-        <w:gridCol w:w="4320"/>
-        <w:gridCol w:w="4320"/>
-      </w:tblGrid>
-      <w:tr>
-        <w:tc>
-          <w:tcPr>
-            <w:tcW w:type="dxa" w:w="4320"/>
-          </w:tcPr>
-          <w:p>
-            <w:r>
-              <w:t>Question</w:t>
-            </w:r>
-          </w:p>
-        </w:tc>
-        <w:tc>
-          <w:tcPr>
-            <w:tcW w:type="dxa" w:w="4320"/>
-          </w:tcPr>
-          <w:p>
-            <w:r>
-              <w:t>Answer</w:t>
-            </w:r>
-          </w:p>
-        </w:tc>
-      </w:tr>
-      <w:tr>
-        <w:tc>
-          <w:tcPr>
-            <w:tcW w:type="dxa" w:w="4320"/>
-          </w:tcPr>
-          <w:p>
-            <w:r>
-              <w:t>Ready to compile?</w:t>
-            </w:r>
-          </w:p>
-        </w:tc>
-        <w:tc>
-          <w:tcPr>
-            <w:tcW w:type="dxa" w:w="4320"/>
-          </w:tcPr>
-          <w:p>
-            <w:r>
-              <w:t>Yes (simulator builds succeeded)</w:t>
-            </w:r>
-          </w:p>
-        </w:tc>
-      </w:tr>
-      <w:tr>
-        <w:tc>
-          <w:tcPr>
-            <w:tcW w:type="dxa" w:w="4320"/>
-          </w:tcPr>
-          <w:p>
-            <w:r>
-              <w:t>Ready for internal test?</w:t>
-            </w:r>
-          </w:p>
-        </w:tc>
-        <w:tc>
-          <w:tcPr>
-            <w:tcW w:type="dxa" w:w="4320"/>
-          </w:tcPr>
-          <w:p>
-            <w:r>
-              <w:t>Yes with pairing checklist</w:t>
-            </w:r>
-          </w:p>
-        </w:tc>
-      </w:tr>
-      <w:tr>
-        <w:tc>
-          <w:tcPr>
-            <w:tcW w:type="dxa" w:w="4320"/>
-          </w:tcPr>
-          <w:p>
-            <w:r>
-              <w:t>Ready for average user?</w:t>
-            </w:r>
-          </w:p>
-        </w:tc>
-        <w:tc>
-          <w:tcPr>
-            <w:tcW w:type="dxa" w:w="4320"/>
-          </w:tcPr>
-          <w:p>
-            <w:r>
-              <w:t>Conditional</w:t>
-            </w:r>
-          </w:p>
-        </w:tc>
-      </w:tr>
-      <w:tr>
-        <w:tc>
-          <w:tcPr>
-            <w:tcW w:type="dxa" w:w="4320"/>
-          </w:tcPr>
-          <w:p>
-            <w:r>
-              <w:t>Ready for TestFlight?</w:t>
-            </w:r>
-          </w:p>
-        </w:tc>
-        <w:tc>
-          <w:tcPr>
-            <w:tcW w:type="dxa" w:w="4320"/>
-          </w:tcPr>
-          <w:p>
-            <w:r>
-              <w:t>After device depth + sync QA</w:t>
-            </w:r>
-          </w:p>
-        </w:tc>
-      </w:tr>
-      <w:tr>
-        <w:tc>
-          <w:tcPr>
-            <w:tcW w:type="dxa" w:w="4320"/>
-          </w:tcPr>
-          <w:p>
-            <w:r>
-              <w:t>Ready for App Store?</w:t>
-            </w:r>
-          </w:p>
-        </w:tc>
-        <w:tc>
-          <w:tcPr>
-            <w:tcW w:type="dxa" w:w="4320"/>
-          </w:tcPr>
-          <w:p>
-            <w:r>
-              <w:t>No</w:t>
-            </w:r>
-          </w:p>
-        </w:tc>
-      </w:tr>
-    </w:tbl>
-    <w:p>
-      <w:r>
-        <w:rPr>
-          <w:b w:val="0"/>
           <w:sz w:val="18"/>
         </w:rPr>
-        <w:t>Full markdown source: Docs/MAIN_BRANCH_COMPLETE_READINESS_AUDIT_20260520.md</w:t>
+        <w:t>Full markdown: MAIN_BRANCH_COMPLETE_READINESS_AUDIT_20260520.md</w:t>
       </w:r>
     </w:p>
     <w:sectPr>

</xml_diff>